<commit_message>
Add the Colab share link to Appendix A
Set COLAB_URL to the shared Colab notebook and rebuild the report, which
replaces the placeholder flagged in the APA proofread (#5, item 1).
</commit_message>
<xml_diff>
--- a/Diabetes_Readmission_Deliverable1_Chinthaluri_Abburi.docx
+++ b/Diabetes_Readmission_Deliverable1_Chinthaluri_Abburi.docx
@@ -8874,16 +8874,17 @@
         </w:rPr>
         <w:t xml:space="preserve">Notebook link (view access for the instructor): </w:t>
       </w:r>
-      <w:r>
-        <w:rPr>
-          <w:rFonts w:ascii="Georgia" w:hAnsi="Georgia"/>
-          <w:b/>
-          <w:i w:val="0"/>
-          <w:color w:val="000000"/>
-          <w:sz w:val="22"/>
-        </w:rPr>
-        <w:t>[PASTE COLAB SHARE LINK]</w:t>
-      </w:r>
+      <w:hyperlink r:id="rId18">
+        <w:r>
+          <w:rPr>
+            <w:rFonts w:ascii="Georgia" w:hAnsi="Georgia"/>
+            <w:color w:val="0563C1"/>
+            <w:u w:val="single"/>
+            <w:sz w:val="22"/>
+          </w:rPr>
+          <w:t xml:space="preserve">https://colab.research.google.com/drive/1soOdtRg06c47cQvjgaBHrjf9M4Fukuu3?usp=sharing</w:t>
+        </w:r>
+      </w:hyperlink>
     </w:p>
     <w:p>
       <w:pPr>

</xml_diff>

<commit_message>
Address Abburi's APA proofread of the report (#5)
- Say which base each readmission rate uses: 11.2% of raw encounters, 11.4%
  of analyzed encounters, and .113 as the test-set prevalence
- Add the JMLR URL to Pedregosa et al. (2011)
- Italicize the M, SD, and n symbols in the Table 3 and Table 5 headers
- Reword the Table 5 note so it no longer contradicts itself
- Mark the proofread as done in TEAM_TASKS
</commit_message>
<xml_diff>
--- a/Diabetes_Readmission_Deliverable1_Chinthaluri_Abburi.docx
+++ b/Diabetes_Readmission_Deliverable1_Chinthaluri_Abburi.docx
@@ -310,7 +310,7 @@
           <w:color w:val="000000"/>
           <w:sz w:val="22"/>
         </w:rPr>
-        <w:t>The analysis uses the Diabetes 130-US Hospitals dataset (Clore et al., 2014): 101,766 inpatient encounters from 71,518 patients at 130 U.S. hospitals between 1999 and 2008. Each encounter is a stay of one to 14 days with a diabetes diagnosis, laboratory testing, and medication (Strack et al., 2014). Its 50 columns cover demographics, admission and discharge codes, prior-year utilization, laboratory and procedure counts, three ICD-9 diagnoses, HbA1c and glucose results, and 23 diabetes medications. The target is readmission within 30 days, coded 1 against both later readmission and none, because only early returns trigger penalties; it occurs in 11.2% of encounters (Figure 1).</w:t>
+        <w:t>The analysis uses the Diabetes 130-US Hospitals dataset (Clore et al., 2014): 101,766 inpatient encounters from 71,518 patients at 130 U.S. hospitals between 1999 and 2008. Each encounter is a stay of one to 14 days with a diabetes diagnosis, laboratory testing, and medication (Strack et al., 2014). Its 50 columns cover demographics, admission and discharge codes, prior-year utilization, laboratory and procedure counts, three ICD-9 diagnoses, HbA1c and glucose results, and 23 diabetes medications. The target is readmission within 30 days, coded 1 against both later readmission and none, because only early returns trigger penalties; it occurs in 11.2% of raw encounters (11.4% after the exclusions described below; Figure 1).</w:t>
       </w:r>
     </w:p>
     <w:p>
@@ -931,7 +931,7 @@
                 <w:color w:val="000000"/>
                 <w:sz w:val="18"/>
               </w:rPr>
-              <w:t>Binary: &lt;30 days = 1 (11.4%); source column removed</w:t>
+              <w:t>Binary: &lt;30 days = 1 (11.4% of analyzed encounters); source column removed</w:t>
             </w:r>
           </w:p>
         </w:tc>
@@ -2987,7 +2987,47 @@
                 <w:color w:val="000000"/>
                 <w:sz w:val="16"/>
               </w:rPr>
-              <w:t>CV ROC-AUC M (SD)</w:t>
+              <w:t xml:space="preserve">CV ROC-AUC </w:t>
+            </w:r>
+            <w:r>
+              <w:rPr>
+                <w:rFonts w:ascii="Georgia" w:hAnsi="Georgia"/>
+                <w:b/>
+                <w:i/>
+                <w:color w:val="000000"/>
+                <w:sz w:val="16"/>
+              </w:rPr>
+              <w:t>M</w:t>
+            </w:r>
+            <w:r>
+              <w:rPr>
+                <w:rFonts w:ascii="Georgia" w:hAnsi="Georgia"/>
+                <w:b/>
+                <w:i w:val="0"/>
+                <w:color w:val="000000"/>
+                <w:sz w:val="16"/>
+              </w:rPr>
+              <w:t xml:space="preserve"> (</w:t>
+            </w:r>
+            <w:r>
+              <w:rPr>
+                <w:rFonts w:ascii="Georgia" w:hAnsi="Georgia"/>
+                <w:b/>
+                <w:i/>
+                <w:color w:val="000000"/>
+                <w:sz w:val="16"/>
+              </w:rPr>
+              <w:t>SD</w:t>
+            </w:r>
+            <w:r>
+              <w:rPr>
+                <w:rFonts w:ascii="Georgia" w:hAnsi="Georgia"/>
+                <w:b/>
+                <w:i w:val="0"/>
+                <w:color w:val="000000"/>
+                <w:sz w:val="16"/>
+              </w:rPr>
+              <w:t>)</w:t>
             </w:r>
           </w:p>
         </w:tc>
@@ -4452,7 +4492,7 @@
           <w:color w:val="000000"/>
           <w:sz w:val="16"/>
         </w:rPr>
-        <w:t>CV = five-fold stratified group cross-validation on 74,583 training encounters; test metrics use 24,757 encounters from 17,497 patients absent from training. Threshold metrics use each model's default decision (0.5), at least one prior admission for the heuristic, and no flags for the dummy. Lift is the readmission rate among the highest-risk share divided by the overall rate. The random forest uses default settings.</w:t>
+        <w:t>CV = five-fold stratified group cross-validation on 74,583 training encounters; test metrics use 24,757 encounters from 17,497 patients absent from training. Threshold metrics use each model's default decision (0.5), at least one prior admission for the heuristic, and no flags for the dummy. Lift is the readmission rate among the highest-risk share divided by the overall rate. The dummy's PR-AUC equals the test-set prevalence (.113). The random forest uses default settings.</w:t>
       </w:r>
     </w:p>
     <w:p>
@@ -4656,7 +4696,7 @@
           <w:color w:val="000000"/>
           <w:sz w:val="20"/>
         </w:rPr>
-        <w:t>Panels (a) and (b) compare both models with the prior-admissions heuristic on the test set; the dotted line in (b) is the prevalence baseline (.113). Panels (c) and (d) are seaborn heatmaps of the confusion matrices at the default threshold.</w:t>
+        <w:t>Panels (a) and (b) compare both models with the prior-admissions heuristic on the test set; the dotted line in (b) is the test-set prevalence baseline (.113). Panels (c) and (d) are seaborn heatmaps of the confusion matrices at the default threshold.</w:t>
       </w:r>
     </w:p>
     <w:p>
@@ -4792,7 +4832,7 @@
           <w:color w:val="000000"/>
           <w:sz w:val="22"/>
         </w:rPr>
-        <w:t>Following the course hints, GridSearchCV tuned both models (Table 4, Figure 8), with two corrections: folds were grouped by patient, and scoring used ROC-AUC, because accuracy rewards the do-nothing behavior shown above. Limiting tree depth raised the forest's test AUC from .635 to .665, whereas the logistic regression barely moved (.661 to .662), because its discrimination is nearly flat across the penalty grid. The tuned forest and the logistic regression are statistically indistinguishable (difference 95% CI [−.001, .008]), so the interpretable model remains the working choice (Rudin, 2019). Class weighting also inflated the mean predicted risk to .469 against an observed .113, so Deliverable 2 will calibrate scores and set thresholds from program capacity.</w:t>
+        <w:t>Following the course hints, GridSearchCV tuned both models (Table 4, Figure 8), with two corrections: folds were grouped by patient, and scoring used ROC-AUC, because accuracy rewards the do-nothing behavior shown above. Limiting tree depth raised the forest's test AUC from .635 to .665, whereas the logistic regression barely moved (.661 to .662), because its discrimination is nearly flat across the penalty grid. The tuned forest and the logistic regression are statistically indistinguishable (difference 95% CI [−.001, .008]), so the interpretable model remains the working choice (Rudin, 2019). Class weighting also inflated the mean predicted risk to .469 against an observed test-set rate of .113, so Deliverable 2 will calibrate scores and set thresholds from program capacity.</w:t>
       </w:r>
     </w:p>
     <w:p>
@@ -5776,7 +5816,7 @@
               <w:rPr>
                 <w:rFonts w:ascii="Georgia" w:hAnsi="Georgia"/>
                 <w:b/>
-                <w:i w:val="0"/>
+                <w:i/>
                 <w:color w:val="000000"/>
                 <w:sz w:val="18"/>
               </w:rPr>
@@ -7548,7 +7588,7 @@
           <w:color w:val="000000"/>
           <w:sz w:val="18"/>
         </w:rPr>
-        <w:t>Flags use the default 0.5 threshold. Groups with fewer than 30 readmissions are omitted because their estimates are unstable. Race, gender, and age group are not model inputs except age, which enters as a band midpoint.</w:t>
+        <w:t>Flags use the default 0.5 threshold. Groups with fewer than 30 readmissions are omitted because their estimates are unstable. Race and gender are not model inputs; age enters only as a band midpoint.</w:t>
       </w:r>
     </w:p>
     <w:p>
@@ -8558,7 +8598,7 @@
           <w:color w:val="000000"/>
           <w:sz w:val="22"/>
         </w:rPr>
-        <w:t>, 2825–2830.</w:t>
+        <w:t>, 2825–2830. https://jmlr.org/papers/v12/pedregosa11a.html</w:t>
       </w:r>
     </w:p>
     <w:p>

</xml_diff>

<commit_message>
Revise Introduction and Ethics sections
Introduction: lead with harm to patients and hospitals, frame the question as
ranking patients to decide who receives follow-up, and judge success by ranking
rather than accuracy.

Ethics: describe use as a daily ranked call list for nurses and lead the
fairness discussion with the weaker discrimination for patients 65 and older.
</commit_message>
<xml_diff>
--- a/Diabetes_Readmission_Deliverable1_Chinthaluri_Abburi.docx
+++ b/Diabetes_Readmission_Deliverable1_Chinthaluri_Abburi.docx
@@ -276,7 +276,7 @@
           <w:color w:val="000000"/>
           <w:sz w:val="22"/>
         </w:rPr>
-        <w:t>Nearly one in five Medicare patients returns to the hospital within 30 days of discharge, at an estimated annual cost of $17.4 billion (Jencks et al., 2009), and the Hospital Readmissions Reduction Program now penalizes hospitals with excess readmissions (McIlvennan et al., 2015). Patients with diabetes are at elevated risk (Rubin, 2015), so the problem affects patients, who bear the harm of a return stay; hospitals, which bear the penalty; and payers, who bear the cost. Hospitals respond with care-transition programs such as follow-up calls and medication reconciliation, but those programs have limited capacity and must be targeted. This project therefore asks: using only information available at discharge, can routinely collected encounter data rank diabetic inpatients by 30-day readmission risk well enough to direct a capacity-limited intervention? Published readmission models discriminate only modestly (Kansagara et al., 2011), so success means outperforming a simple clinical heuristic rather than reaching high accuracy.</w:t>
+        <w:t>A readmission within 30 days hurts two groups at once. Patients return to the hospital sicker than when they left, and hospitals pay for it under the Hospital Readmissions Reduction Program, which penalizes excess readmissions (McIlvennan et al., 2015). The problem is large: nearly one in five Medicare patients is readmitted within 30 days, at an estimated $17.4 billion a year (Jencks et al., 2009), and patients with diabetes are at higher risk than most (Rubin, 2015). Hospitals try to prevent these returns with follow-up calls and medication reconciliation, but such programs can reach only some patients, so the real question is whom to contact first. This project therefore asks: using only information available at discharge, can routinely collected encounter data rank diabetic inpatients by 30-day readmission risk well enough to decide who receives follow-up? We judge success by ranking, not accuracy. Published readmission models discriminate only modestly (Kansagara et al., 2011), so a model is useful if it beats a simple clinical heuristic and concentrates readmissions at the top of its list.</w:t>
       </w:r>
     </w:p>
     <w:p>
@@ -5657,7 +5657,7 @@
           <w:color w:val="000000"/>
           <w:sz w:val="22"/>
         </w:rPr>
-        <w:t>In practice the model would support, not replace, discharge planning: the care-transition team would receive each day's discharges ranked by risk and contact as many as capacity allows. At 10% capacity, per 1,000 discharges the team would reach about 23 of the 113 patients who will be readmitted, against about 11 by random selection. Four ethical issues bound that use. First, bias by proxy: prior admissions, the strongest predictor, measures access to care as well as need, so patients who struggle to reach a hospital may be under-flagged (Obermeyer et al., 2019); excluding race and payer as inputs does not remove such proxies. Table 5 shows nearly identical discrimination for the two largest race groups (AUC .658 and .661) but two gaps: women were flagged more often than men (38.8% vs. 34.6%) at nearly equal readmission rates, and discrimination was weaker for patients 65 and older (AUC .633 vs. .713), the Medicare population the penalty program targets. Deliverable 2 will test both gaps for miscalibration. Second, transparency: the coefficients in Figure 7 can be reviewed by clinicians. Third, error costs are asymmetric, since a missed patient loses support whereas a false alarm costs a phone call, which favors recall within capacity. Fourth, privacy: the public file holds no names or dates, and a deployed version would run under HIPAA.</w:t>
+        <w:t>In practice the model would support, not replace, discharge planning. Each day the care-transition nurses would receive that day's discharges ranked by risk and call patients from the top of the list for as long as capacity allows. At 10% capacity, per 1,000 discharges they would reach about 23 of the 113 patients who will be readmitted, against about 11 by random selection. The ethical concern we consider most serious is the age gap in Table 5: discrimination was clearly weaker for patients 65 and older (AUC .633 vs. .713), yet they are the Medicare population the penalty program targets, so the model is least reliable for the patients it most needs to serve. Two other fairness issues need watching. Women were flagged more often than men (38.8% vs. 34.6%) at nearly equal readmission rates, although the two largest race groups showed nearly identical discrimination (AUC .658 and .661). And prior admissions, the strongest predictor, measures access to care as well as need, so patients who struggle to reach a hospital may be under-flagged (Obermeyer et al., 2019); excluding race and payer as inputs does not remove such proxies. Deliverable 2 will test the age and gender gaps for miscalibration. Three safeguards also apply: clinicians can review the coefficients in Figure 7; errors are asymmetric, since a missed patient loses support whereas a false alarm costs a phone call, which favors recall within capacity; and the public file holds no names or dates, while a deployed version would run under HIPAA.</w:t>
       </w:r>
     </w:p>
     <w:p>

</xml_diff>

<commit_message>
Apply review suggestions from #13
Replace the uncited claim that readmitted patients return sicker with neutral
wording, and call the closing ethics points considerations rather than safeguards.
</commit_message>
<xml_diff>
--- a/Diabetes_Readmission_Deliverable1_Chinthaluri_Abburi.docx
+++ b/Diabetes_Readmission_Deliverable1_Chinthaluri_Abburi.docx
@@ -276,7 +276,7 @@
           <w:color w:val="000000"/>
           <w:sz w:val="22"/>
         </w:rPr>
-        <w:t>A readmission within 30 days hurts two groups at once. Patients return to the hospital sicker than when they left, and hospitals pay for it under the Hospital Readmissions Reduction Program, which penalizes excess readmissions (McIlvennan et al., 2015). The problem is large: nearly one in five Medicare patients is readmitted within 30 days, at an estimated $17.4 billion a year (Jencks et al., 2009), and patients with diabetes are at higher risk than most (Rubin, 2015). Hospitals try to prevent these returns with follow-up calls and medication reconciliation, but such programs can reach only some patients, so the real question is whom to contact first. This project therefore asks: using only information available at discharge, can routinely collected encounter data rank diabetic inpatients by 30-day readmission risk well enough to decide who receives follow-up? We judge success by ranking, not accuracy. Published readmission models discriminate only modestly (Kansagara et al., 2011), so a model is useful if it beats a simple clinical heuristic and concentrates readmissions at the top of its list.</w:t>
+        <w:t>A readmission within 30 days hurts two groups at once. Patients face another hospital stay, and hospitals pay for it under the Hospital Readmissions Reduction Program, which penalizes excess readmissions (McIlvennan et al., 2015). The problem is large: nearly one in five Medicare patients is readmitted within 30 days, at an estimated $17.4 billion a year (Jencks et al., 2009), and patients with diabetes are at higher risk than most (Rubin, 2015). Hospitals try to prevent these returns with follow-up calls and medication reconciliation, but such programs can reach only some patients, so the real question is whom to contact first. This project therefore asks: using only information available at discharge, can routinely collected encounter data rank diabetic inpatients by 30-day readmission risk well enough to decide who receives follow-up? We judge success by ranking, not accuracy. Published readmission models discriminate only modestly (Kansagara et al., 2011), so a model is useful if it beats a simple clinical heuristic and concentrates readmissions at the top of its list.</w:t>
       </w:r>
     </w:p>
     <w:p>
@@ -5657,7 +5657,7 @@
           <w:color w:val="000000"/>
           <w:sz w:val="22"/>
         </w:rPr>
-        <w:t>In practice the model would support, not replace, discharge planning. Each day the care-transition nurses would receive that day's discharges ranked by risk and call patients from the top of the list for as long as capacity allows. At 10% capacity, per 1,000 discharges they would reach about 23 of the 113 patients who will be readmitted, against about 11 by random selection. The ethical concern we consider most serious is the age gap in Table 5: discrimination was clearly weaker for patients 65 and older (AUC .633 vs. .713), yet they are the Medicare population the penalty program targets, so the model is least reliable for the patients it most needs to serve. Two other fairness issues need watching. Women were flagged more often than men (38.8% vs. 34.6%) at nearly equal readmission rates, although the two largest race groups showed nearly identical discrimination (AUC .658 and .661). And prior admissions, the strongest predictor, measures access to care as well as need, so patients who struggle to reach a hospital may be under-flagged (Obermeyer et al., 2019); excluding race and payer as inputs does not remove such proxies. Deliverable 2 will test the age and gender gaps for miscalibration. Three safeguards also apply: clinicians can review the coefficients in Figure 7; errors are asymmetric, since a missed patient loses support whereas a false alarm costs a phone call, which favors recall within capacity; and the public file holds no names or dates, while a deployed version would run under HIPAA.</w:t>
+        <w:t>In practice the model would support, not replace, discharge planning. Each day the care-transition nurses would receive that day's discharges ranked by risk and call patients from the top of the list for as long as capacity allows. At 10% capacity, per 1,000 discharges they would reach about 23 of the 113 patients who will be readmitted, against about 11 by random selection. The ethical concern we consider most serious is the age gap in Table 5: discrimination was clearly weaker for patients 65 and older (AUC .633 vs. .713), yet they are the Medicare population the penalty program targets, so the model is least reliable for the patients it most needs to serve. Two other fairness issues need watching. Women were flagged more often than men (38.8% vs. 34.6%) at nearly equal readmission rates, although the two largest race groups showed nearly identical discrimination (AUC .658 and .661). And prior admissions, the strongest predictor, measures access to care as well as need, so patients who struggle to reach a hospital may be under-flagged (Obermeyer et al., 2019); excluding race and payer as inputs does not remove such proxies. Deliverable 2 will test the age and gender gaps for miscalibration. Three considerations also apply: clinicians can review the coefficients in Figure 7; errors are asymmetric, since a missed patient loses support whereas a false alarm costs a phone call, which favors recall within capacity; and the public file holds no names or dates, while a deployed version would run under HIPAA.</w:t>
       </w:r>
     </w:p>
     <w:p>

</xml_diff>

<commit_message>
Describe team roles by the work each member does
Write the Team Collaboration Process in our joint voice and describe each
member's lead areas by the work itself (data audit, modeling, framing,
ethical analysis, deployment scenario). Rename the ethics section to
Ethical Considerations and Use in Practice, keep the course-hints map as
Appendix A, Table A1, and align the README, TEAM_TASKS.md, DECISIONS.md,
and the issue template with the same wording.
</commit_message>
<xml_diff>
--- a/Diabetes_Readmission_Deliverable1_Chinthaluri_Abburi.docx
+++ b/Diabetes_Readmission_Deliverable1_Chinthaluri_Abburi.docx
@@ -276,7 +276,7 @@
           <w:color w:val="000000"/>
           <w:sz w:val="22"/>
         </w:rPr>
-        <w:t>A readmission within 30 days hurts two groups at once. Patients face another hospital stay, and hospitals pay for it under the Hospital Readmissions Reduction Program, which penalizes excess readmissions (McIlvennan et al., 2015). The problem is large: nearly one in five Medicare patients is readmitted within 30 days, at an estimated $17.4 billion a year (Jencks et al., 2009), and patients with diabetes are at higher risk than most (Rubin, 2015). Hospitals try to prevent these returns with follow-up calls and medication reconciliation, but such programs can reach only some patients, so the real question is whom to contact first. This project therefore asks: using only information available at discharge, can routinely collected encounter data rank diabetic inpatients by 30-day readmission risk well enough to decide who receives follow-up? We judge success by ranking, not accuracy. Published readmission models discriminate only modestly (Kansagara et al., 2011), so a model is useful if it beats a simple clinical heuristic and concentrates readmissions at the top of its list.</w:t>
+        <w:t>A readmission within 30 days hurts two groups at once. Patients face another hospital stay, and hospitals pay for it under the Hospital Readmissions Reduction Program, which penalizes excess readmissions (McIlvennan et al., 2015). The problem is large: nearly one in five Medicare patients is readmitted within 30 days, at an estimated $17.4 billion a year (Jencks et al., 2009), and patients with diabetes are at higher risk than most (Rubin, 2015). Hospitals try to prevent these returns with follow-up calls and medication reconciliation, but such programs can reach only some patients, so the real question is whom to contact first. We therefore ask: using only information available at discharge, can routinely collected encounter data rank diabetic inpatients by 30-day readmission risk well enough to decide who receives follow-up? We judge success by ranking, not accuracy. Published readmission models discriminate only modestly (Kansagara et al., 2011), so a model is useful if it beats a simple clinical heuristic and concentrates readmissions at the top of its list.</w:t>
       </w:r>
     </w:p>
     <w:p>
@@ -5680,7 +5680,7 @@
           <w:color w:val="000000"/>
           <w:sz w:val="22"/>
         </w:rPr>
-        <w:t>Ethical Considerations and Real-World Application</w:t>
+        <w:t>Ethical Considerations and Use in Practice</w:t>
       </w:r>
     </w:p>
     <w:p>
@@ -7622,7 +7622,7 @@
           <w:color w:val="000000"/>
           <w:sz w:val="22"/>
         </w:rPr>
-        <w:t>The two members carry equal shares: each leads three rubric criteria and reviews the other's three (Table 6). In this deliverable, Chinthaluri led data exploration, preprocessing, modeling, and preliminary tuning, while Abburi led problem framing, ethical analysis, and the real-world application and independently re-ran the notebook in Google Colab to confirm every reported number. The roles rotate in Deliverable 2, where Abburi leads optimization and Chinthaluri leads the fairness audit, so each member leads the core modeling once. The code is tracked in a shared GitHub repository: each task is built on its own branch, assigned as an issue, and merged only after the other member approves the pull request, so the history records both authorship and review. The notebook, built with pandas, Matplotlib (Hunter, 2007), seaborn, and scikit-learn, opens in Colab from that repository. Decisions are logged with proposer and reviewer, the members meet weekly, and because the report is regenerated from the notebook's results file (Sandve et al., 2013), either member's change reaches every table automatically.</w:t>
+        <w:t>We shared the work equally, each of us leading part of it and reviewing the other's (Table 6). In this deliverable, Chinthaluri led the data audit, cleaning, feature engineering, modeling, and preliminary tuning, while Abburi led the problem framing, the ethical analysis, and the deployment scenario, proofread the report, and independently re-ran the notebook, including in Google Colab, confirming the reported test-set results. The roles rotate in Deliverable 2, where Abburi leads model tuning and Chinthaluri leads the fairness audit, so each of us leads the core modeling once. We tracked the work in a shared GitHub repository: tasks were assigned as issues, and each change was built on its own branch and merged only after the other member approved the pull request, so the history records both authorship and review. The notebook, built with pandas, Matplotlib (Hunter, 2007), seaborn, and scikit-learn, opens in Colab from that repository. We logged each decision with its proposer and reviewer and held our first check-in in person on October 31, and because the report is regenerated from the notebook's results file (Sandve et al., 2013), either member's change reaches every table automatically.</w:t>
       </w:r>
     </w:p>
     <w:p>
@@ -7932,7 +7932,7 @@
                 <w:color w:val="000000"/>
                 <w:sz w:val="18"/>
               </w:rPr>
-              <w:t>Dataset exploration and preprocessing; model development; preliminary tuning</w:t>
+              <w:t>Data audit and cleaning; feature engineering; modeling; preliminary tuning</w:t>
             </w:r>
           </w:p>
         </w:tc>
@@ -7961,7 +7961,7 @@
                 <w:color w:val="000000"/>
                 <w:sz w:val="18"/>
               </w:rPr>
-              <w:t>Problem framing; ethics; real-world application</w:t>
+              <w:t>Introduction; ethical analysis; deployment scenario</w:t>
             </w:r>
           </w:p>
         </w:tc>
@@ -8082,7 +8082,7 @@
                 <w:color w:val="000000"/>
                 <w:sz w:val="18"/>
               </w:rPr>
-              <w:t>Problem framing; ethical analysis; real-world application; Colab reproduction</w:t>
+              <w:t>Introduction; ethical analysis; deployment scenario; Colab reproduction; APA proofread</w:t>
             </w:r>
           </w:p>
         </w:tc>
@@ -8111,7 +8111,7 @@
                 <w:color w:val="000000"/>
                 <w:sz w:val="18"/>
               </w:rPr>
-              <w:t>Preprocessing, modeling, and tuning pull requests</w:t>
+              <w:t>Data, modeling, and tuning pull requests</w:t>
             </w:r>
           </w:p>
         </w:tc>
@@ -8140,7 +8140,7 @@
                 <w:color w:val="000000"/>
                 <w:sz w:val="18"/>
               </w:rPr>
-              <w:t>Optimization: tuning, boosting, calibration, thresholds</w:t>
+              <w:t>Model tuning, boosting, calibration, and thresholds</w:t>
             </w:r>
           </w:p>
         </w:tc>
@@ -8169,7 +8169,7 @@
           <w:color w:val="000000"/>
           <w:sz w:val="18"/>
         </w:rPr>
-        <w:t>Each member leads three rubric criteria and reviews the other's three (Appendix A, Table A1); writing is shared, and both approve the final report. Repository: https://github.com/ychinthaluri53651/diabetes-readmission-residency-day-1</w:t>
+        <w:t>Each member leads part of the work and reviews the other's; the writing is shared. Repository: https://github.com/ychinthaluri53651/diabetes-readmission-residency-day-1</w:t>
       </w:r>
     </w:p>
     <w:p>
@@ -8896,7 +8896,7 @@
           <w:color w:val="000000"/>
           <w:sz w:val="22"/>
         </w:rPr>
-        <w:t>Google Colab Notebook, Rubric Map, and Course-Hints Map</w:t>
+        <w:t>Google Colab Notebook and Course-Hints Map</w:t>
       </w:r>
     </w:p>
     <w:p>
@@ -8940,7 +8940,7 @@
           <w:color w:val="000000"/>
           <w:sz w:val="22"/>
         </w:rPr>
-        <w:t>The notebook (Diabetes_Readmission_D1_Chinthaluri_Abburi.ipynb) is self-contained: on first run it downloads the UCI archive, then executes top to bottom and writes every figure and reported number. Table A1 maps each rubric criterion to where this report and the notebook address it, and Table A2 shows how each course hint was followed, including the three applied in corrected form.</w:t>
+        <w:t>The notebook (Diabetes_Readmission_D1_Chinthaluri_Abburi.ipynb) is self-contained: on first run it downloads the UCI archive, then executes top to bottom and writes every figure and reported number. Table A1 shows how each course hint was followed, including the three applied in corrected form.</w:t>
       </w:r>
     </w:p>
     <w:p>
@@ -8958,1162 +8958,6 @@
           <w:sz w:val="22"/>
         </w:rPr>
         <w:t>Table A1</w:t>
-      </w:r>
-    </w:p>
-    <w:p>
-      <w:pPr>
-        <w:keepNext/>
-        <w:keepLines/>
-        <w:spacing w:line="480" w:lineRule="auto" w:after="0"/>
-      </w:pPr>
-      <w:r>
-        <w:rPr>
-          <w:rFonts w:ascii="Georgia" w:hAnsi="Georgia"/>
-          <w:b w:val="0"/>
-          <w:i/>
-          <w:color w:val="000000"/>
-          <w:sz w:val="22"/>
-        </w:rPr>
-        <w:t>Project Rubric Criteria, Where Each Is Addressed, and Who Leads It</w:t>
-      </w:r>
-    </w:p>
-    <w:tbl>
-      <w:tblPr>
-        <w:tblW w:type="auto" w:w="0"/>
-        <w:tblLayout w:type="fixed"/>
-        <w:tblLook w:firstColumn="1" w:firstRow="1" w:lastColumn="0" w:lastRow="0" w:noHBand="0" w:noVBand="1" w:val="04A0"/>
-        <w:tblBorders>
-          <w:top w:val="single" w:sz="6" w:color="000000"/>
-          <w:bottom w:val="single" w:sz="6" w:color="000000"/>
-          <w:left w:val="none"/>
-          <w:right w:val="none"/>
-          <w:insideH w:val="none"/>
-          <w:insideV w:val="none"/>
-        </w:tblBorders>
-      </w:tblPr>
-      <w:tblGrid>
-        <w:gridCol w:w="2340"/>
-        <w:gridCol w:w="2340"/>
-        <w:gridCol w:w="2340"/>
-        <w:gridCol w:w="2340"/>
-      </w:tblGrid>
-      <w:tr>
-        <w:trPr>
-          <w:cantSplit w:val="true"/>
-        </w:trPr>
-        <w:tc>
-          <w:tcPr>
-            <w:tcW w:type="dxa" w:w="1685"/>
-            <w:tcBorders>
-              <w:bottom w:val="single" w:sz="6" w:color="000000"/>
-            </w:tcBorders>
-            <w:tcMar>
-              <w:top w:w="40" w:type="dxa"/>
-              <w:bottom w:w="40" w:type="dxa"/>
-              <w:left w:w="110" w:type="dxa"/>
-              <w:right w:w="110" w:type="dxa"/>
-            </w:tcMar>
-            <w:vAlign w:val="center"/>
-          </w:tcPr>
-          <w:p>
-            <w:pPr>
-              <w:spacing w:line="240" w:lineRule="auto" w:after="0"/>
-              <w:jc w:val="left"/>
-            </w:pPr>
-            <w:r/>
-            <w:r>
-              <w:rPr>
-                <w:rFonts w:ascii="Georgia" w:hAnsi="Georgia"/>
-                <w:b/>
-                <w:i w:val="0"/>
-                <w:color w:val="000000"/>
-                <w:sz w:val="17"/>
-              </w:rPr>
-              <w:t>Criterion</w:t>
-            </w:r>
-          </w:p>
-        </w:tc>
-        <w:tc>
-          <w:tcPr>
-            <w:tcW w:type="dxa" w:w="2434"/>
-            <w:tcBorders>
-              <w:bottom w:val="single" w:sz="6" w:color="000000"/>
-            </w:tcBorders>
-            <w:tcMar>
-              <w:top w:w="40" w:type="dxa"/>
-              <w:bottom w:w="40" w:type="dxa"/>
-              <w:left w:w="110" w:type="dxa"/>
-              <w:right w:w="110" w:type="dxa"/>
-            </w:tcMar>
-            <w:vAlign w:val="center"/>
-          </w:tcPr>
-          <w:p>
-            <w:pPr>
-              <w:spacing w:line="240" w:lineRule="auto" w:after="0"/>
-              <w:jc w:val="left"/>
-            </w:pPr>
-            <w:r/>
-            <w:r>
-              <w:rPr>
-                <w:rFonts w:ascii="Georgia" w:hAnsi="Georgia"/>
-                <w:b/>
-                <w:i w:val="0"/>
-                <w:color w:val="000000"/>
-                <w:sz w:val="17"/>
-              </w:rPr>
-              <w:t>Where in the report</w:t>
-            </w:r>
-          </w:p>
-        </w:tc>
-        <w:tc>
-          <w:tcPr>
-            <w:tcW w:type="dxa" w:w="3557"/>
-            <w:tcBorders>
-              <w:bottom w:val="single" w:sz="6" w:color="000000"/>
-            </w:tcBorders>
-            <w:tcMar>
-              <w:top w:w="40" w:type="dxa"/>
-              <w:bottom w:w="40" w:type="dxa"/>
-              <w:left w:w="110" w:type="dxa"/>
-              <w:right w:w="110" w:type="dxa"/>
-            </w:tcMar>
-            <w:vAlign w:val="center"/>
-          </w:tcPr>
-          <w:p>
-            <w:pPr>
-              <w:spacing w:line="240" w:lineRule="auto" w:after="0"/>
-              <w:jc w:val="left"/>
-            </w:pPr>
-            <w:r/>
-            <w:r>
-              <w:rPr>
-                <w:rFonts w:ascii="Georgia" w:hAnsi="Georgia"/>
-                <w:b/>
-                <w:i w:val="0"/>
-                <w:color w:val="000000"/>
-                <w:sz w:val="17"/>
-              </w:rPr>
-              <w:t>Evidence</w:t>
-            </w:r>
-          </w:p>
-        </w:tc>
-        <w:tc>
-          <w:tcPr>
-            <w:tcW w:type="dxa" w:w="1685"/>
-            <w:tcBorders>
-              <w:bottom w:val="single" w:sz="6" w:color="000000"/>
-            </w:tcBorders>
-            <w:tcMar>
-              <w:top w:w="40" w:type="dxa"/>
-              <w:bottom w:w="40" w:type="dxa"/>
-              <w:left w:w="110" w:type="dxa"/>
-              <w:right w:w="110" w:type="dxa"/>
-            </w:tcMar>
-            <w:vAlign w:val="center"/>
-          </w:tcPr>
-          <w:p>
-            <w:pPr>
-              <w:spacing w:line="240" w:lineRule="auto" w:after="0"/>
-              <w:jc w:val="left"/>
-            </w:pPr>
-            <w:r/>
-            <w:r>
-              <w:rPr>
-                <w:rFonts w:ascii="Georgia" w:hAnsi="Georgia"/>
-                <w:b/>
-                <w:i w:val="0"/>
-                <w:color w:val="000000"/>
-                <w:sz w:val="17"/>
-              </w:rPr>
-              <w:t>Lead / reviewer</w:t>
-            </w:r>
-          </w:p>
-        </w:tc>
-      </w:tr>
-      <w:tr>
-        <w:trPr>
-          <w:cantSplit w:val="true"/>
-        </w:trPr>
-        <w:tc>
-          <w:tcPr>
-            <w:tcW w:type="dxa" w:w="1685"/>
-            <w:tcMar>
-              <w:top w:w="40" w:type="dxa"/>
-              <w:bottom w:w="40" w:type="dxa"/>
-              <w:left w:w="110" w:type="dxa"/>
-              <w:right w:w="110" w:type="dxa"/>
-            </w:tcMar>
-            <w:vAlign w:val="center"/>
-          </w:tcPr>
-          <w:p>
-            <w:pPr>
-              <w:spacing w:line="240" w:lineRule="auto" w:after="0"/>
-              <w:jc w:val="left"/>
-            </w:pPr>
-            <w:r/>
-            <w:r>
-              <w:rPr>
-                <w:rFonts w:ascii="Georgia" w:hAnsi="Georgia"/>
-                <w:b w:val="0"/>
-                <w:i w:val="0"/>
-                <w:color w:val="000000"/>
-                <w:sz w:val="17"/>
-              </w:rPr>
-              <w:t>Problem definition</w:t>
-            </w:r>
-          </w:p>
-        </w:tc>
-        <w:tc>
-          <w:tcPr>
-            <w:tcW w:type="dxa" w:w="2434"/>
-            <w:tcMar>
-              <w:top w:w="40" w:type="dxa"/>
-              <w:bottom w:w="40" w:type="dxa"/>
-              <w:left w:w="110" w:type="dxa"/>
-              <w:right w:w="110" w:type="dxa"/>
-            </w:tcMar>
-            <w:vAlign w:val="center"/>
-          </w:tcPr>
-          <w:p>
-            <w:pPr>
-              <w:spacing w:line="240" w:lineRule="auto" w:after="0"/>
-              <w:jc w:val="left"/>
-            </w:pPr>
-            <w:r/>
-            <w:r>
-              <w:rPr>
-                <w:rFonts w:ascii="Georgia" w:hAnsi="Georgia"/>
-                <w:b w:val="0"/>
-                <w:i w:val="0"/>
-                <w:color w:val="000000"/>
-                <w:sz w:val="17"/>
-              </w:rPr>
-              <w:t>Introduction and Problem Framing</w:t>
-            </w:r>
-          </w:p>
-        </w:tc>
-        <w:tc>
-          <w:tcPr>
-            <w:tcW w:type="dxa" w:w="3557"/>
-            <w:tcMar>
-              <w:top w:w="40" w:type="dxa"/>
-              <w:bottom w:w="40" w:type="dxa"/>
-              <w:left w:w="110" w:type="dxa"/>
-              <w:right w:w="110" w:type="dxa"/>
-            </w:tcMar>
-            <w:vAlign w:val="center"/>
-          </w:tcPr>
-          <w:p>
-            <w:pPr>
-              <w:spacing w:line="240" w:lineRule="auto" w:after="0"/>
-              <w:jc w:val="left"/>
-            </w:pPr>
-            <w:r/>
-            <w:r>
-              <w:rPr>
-                <w:rFonts w:ascii="Georgia" w:hAnsi="Georgia"/>
-                <w:b w:val="0"/>
-                <w:i w:val="0"/>
-                <w:color w:val="000000"/>
-                <w:sz w:val="17"/>
-              </w:rPr>
-              <w:t>Stakeholders, penalty context, and a capacity-limited question</w:t>
-            </w:r>
-          </w:p>
-        </w:tc>
-        <w:tc>
-          <w:tcPr>
-            <w:tcW w:type="dxa" w:w="1685"/>
-            <w:tcMar>
-              <w:top w:w="40" w:type="dxa"/>
-              <w:bottom w:w="40" w:type="dxa"/>
-              <w:left w:w="110" w:type="dxa"/>
-              <w:right w:w="110" w:type="dxa"/>
-            </w:tcMar>
-            <w:vAlign w:val="center"/>
-          </w:tcPr>
-          <w:p>
-            <w:pPr>
-              <w:spacing w:line="240" w:lineRule="auto" w:after="0"/>
-              <w:jc w:val="left"/>
-            </w:pPr>
-            <w:r/>
-            <w:r>
-              <w:rPr>
-                <w:rFonts w:ascii="Georgia" w:hAnsi="Georgia"/>
-                <w:b w:val="0"/>
-                <w:i w:val="0"/>
-                <w:color w:val="000000"/>
-                <w:sz w:val="17"/>
-              </w:rPr>
-              <w:t>Abburi / Chinthaluri</w:t>
-            </w:r>
-          </w:p>
-        </w:tc>
-      </w:tr>
-      <w:tr>
-        <w:trPr>
-          <w:cantSplit w:val="true"/>
-        </w:trPr>
-        <w:tc>
-          <w:tcPr>
-            <w:tcW w:type="dxa" w:w="1685"/>
-            <w:tcMar>
-              <w:top w:w="40" w:type="dxa"/>
-              <w:bottom w:w="40" w:type="dxa"/>
-              <w:left w:w="110" w:type="dxa"/>
-              <w:right w:w="110" w:type="dxa"/>
-            </w:tcMar>
-            <w:vAlign w:val="center"/>
-          </w:tcPr>
-          <w:p>
-            <w:pPr>
-              <w:spacing w:line="240" w:lineRule="auto" w:after="0"/>
-              <w:jc w:val="left"/>
-            </w:pPr>
-            <w:r/>
-            <w:r>
-              <w:rPr>
-                <w:rFonts w:ascii="Georgia" w:hAnsi="Georgia"/>
-                <w:b w:val="0"/>
-                <w:i w:val="0"/>
-                <w:color w:val="000000"/>
-                <w:sz w:val="17"/>
-              </w:rPr>
-              <w:t>Dataset exploration</w:t>
-            </w:r>
-          </w:p>
-        </w:tc>
-        <w:tc>
-          <w:tcPr>
-            <w:tcW w:type="dxa" w:w="2434"/>
-            <w:tcMar>
-              <w:top w:w="40" w:type="dxa"/>
-              <w:bottom w:w="40" w:type="dxa"/>
-              <w:left w:w="110" w:type="dxa"/>
-              <w:right w:w="110" w:type="dxa"/>
-            </w:tcMar>
-            <w:vAlign w:val="center"/>
-          </w:tcPr>
-          <w:p>
-            <w:pPr>
-              <w:spacing w:line="240" w:lineRule="auto" w:after="0"/>
-              <w:jc w:val="left"/>
-            </w:pPr>
-            <w:r/>
-            <w:r>
-              <w:rPr>
-                <w:rFonts w:ascii="Georgia" w:hAnsi="Georgia"/>
-                <w:b w:val="0"/>
-                <w:i w:val="0"/>
-                <w:color w:val="000000"/>
-                <w:sz w:val="17"/>
-              </w:rPr>
-              <w:t>Dataset Exploration and Preprocessing</w:t>
-            </w:r>
-          </w:p>
-        </w:tc>
-        <w:tc>
-          <w:tcPr>
-            <w:tcW w:type="dxa" w:w="3557"/>
-            <w:tcMar>
-              <w:top w:w="40" w:type="dxa"/>
-              <w:bottom w:w="40" w:type="dxa"/>
-              <w:left w:w="110" w:type="dxa"/>
-              <w:right w:w="110" w:type="dxa"/>
-            </w:tcMar>
-            <w:vAlign w:val="center"/>
-          </w:tcPr>
-          <w:p>
-            <w:pPr>
-              <w:spacing w:line="240" w:lineRule="auto" w:after="0"/>
-              <w:jc w:val="left"/>
-            </w:pPr>
-            <w:r/>
-            <w:r>
-              <w:rPr>
-                <w:rFonts w:ascii="Georgia" w:hAnsi="Georgia"/>
-                <w:b w:val="0"/>
-                <w:i w:val="0"/>
-                <w:color w:val="000000"/>
-                <w:sz w:val="17"/>
-              </w:rPr>
-              <w:t>Figures 1–3; Tables 1 and 2; notebook Sections 2–6</w:t>
-            </w:r>
-          </w:p>
-        </w:tc>
-        <w:tc>
-          <w:tcPr>
-            <w:tcW w:type="dxa" w:w="1685"/>
-            <w:tcMar>
-              <w:top w:w="40" w:type="dxa"/>
-              <w:bottom w:w="40" w:type="dxa"/>
-              <w:left w:w="110" w:type="dxa"/>
-              <w:right w:w="110" w:type="dxa"/>
-            </w:tcMar>
-            <w:vAlign w:val="center"/>
-          </w:tcPr>
-          <w:p>
-            <w:pPr>
-              <w:spacing w:line="240" w:lineRule="auto" w:after="0"/>
-              <w:jc w:val="left"/>
-            </w:pPr>
-            <w:r/>
-            <w:r>
-              <w:rPr>
-                <w:rFonts w:ascii="Georgia" w:hAnsi="Georgia"/>
-                <w:b w:val="0"/>
-                <w:i w:val="0"/>
-                <w:color w:val="000000"/>
-                <w:sz w:val="17"/>
-              </w:rPr>
-              <w:t>Chinthaluri / Abburi</w:t>
-            </w:r>
-          </w:p>
-        </w:tc>
-      </w:tr>
-      <w:tr>
-        <w:trPr>
-          <w:cantSplit w:val="true"/>
-        </w:trPr>
-        <w:tc>
-          <w:tcPr>
-            <w:tcW w:type="dxa" w:w="1685"/>
-            <w:tcMar>
-              <w:top w:w="40" w:type="dxa"/>
-              <w:bottom w:w="40" w:type="dxa"/>
-              <w:left w:w="110" w:type="dxa"/>
-              <w:right w:w="110" w:type="dxa"/>
-            </w:tcMar>
-            <w:vAlign w:val="center"/>
-          </w:tcPr>
-          <w:p>
-            <w:pPr>
-              <w:spacing w:line="240" w:lineRule="auto" w:after="0"/>
-              <w:jc w:val="left"/>
-            </w:pPr>
-            <w:r/>
-            <w:r>
-              <w:rPr>
-                <w:rFonts w:ascii="Georgia" w:hAnsi="Georgia"/>
-                <w:b w:val="0"/>
-                <w:i w:val="0"/>
-                <w:color w:val="000000"/>
-                <w:sz w:val="17"/>
-              </w:rPr>
-              <w:t>Model development</w:t>
-            </w:r>
-          </w:p>
-        </w:tc>
-        <w:tc>
-          <w:tcPr>
-            <w:tcW w:type="dxa" w:w="2434"/>
-            <w:tcMar>
-              <w:top w:w="40" w:type="dxa"/>
-              <w:bottom w:w="40" w:type="dxa"/>
-              <w:left w:w="110" w:type="dxa"/>
-              <w:right w:w="110" w:type="dxa"/>
-            </w:tcMar>
-            <w:vAlign w:val="center"/>
-          </w:tcPr>
-          <w:p>
-            <w:pPr>
-              <w:spacing w:line="240" w:lineRule="auto" w:after="0"/>
-              <w:jc w:val="left"/>
-            </w:pPr>
-            <w:r/>
-            <w:r>
-              <w:rPr>
-                <w:rFonts w:ascii="Georgia" w:hAnsi="Georgia"/>
-                <w:b w:val="0"/>
-                <w:i w:val="0"/>
-                <w:color w:val="000000"/>
-                <w:sz w:val="17"/>
-              </w:rPr>
-              <w:t>Model Selection and Initial Results</w:t>
-            </w:r>
-          </w:p>
-        </w:tc>
-        <w:tc>
-          <w:tcPr>
-            <w:tcW w:type="dxa" w:w="3557"/>
-            <w:tcMar>
-              <w:top w:w="40" w:type="dxa"/>
-              <w:bottom w:w="40" w:type="dxa"/>
-              <w:left w:w="110" w:type="dxa"/>
-              <w:right w:w="110" w:type="dxa"/>
-            </w:tcMar>
-            <w:vAlign w:val="center"/>
-          </w:tcPr>
-          <w:p>
-            <w:pPr>
-              <w:spacing w:line="240" w:lineRule="auto" w:after="0"/>
-              <w:jc w:val="left"/>
-            </w:pPr>
-            <w:r/>
-            <w:r>
-              <w:rPr>
-                <w:rFonts w:ascii="Georgia" w:hAnsi="Georgia"/>
-                <w:b w:val="0"/>
-                <w:i w:val="0"/>
-                <w:color w:val="000000"/>
-                <w:sz w:val="17"/>
-              </w:rPr>
-              <w:t>Two justified models and two references; Table 3; Figures 5–7</w:t>
-            </w:r>
-          </w:p>
-        </w:tc>
-        <w:tc>
-          <w:tcPr>
-            <w:tcW w:type="dxa" w:w="1685"/>
-            <w:tcMar>
-              <w:top w:w="40" w:type="dxa"/>
-              <w:bottom w:w="40" w:type="dxa"/>
-              <w:left w:w="110" w:type="dxa"/>
-              <w:right w:w="110" w:type="dxa"/>
-            </w:tcMar>
-            <w:vAlign w:val="center"/>
-          </w:tcPr>
-          <w:p>
-            <w:pPr>
-              <w:spacing w:line="240" w:lineRule="auto" w:after="0"/>
-              <w:jc w:val="left"/>
-            </w:pPr>
-            <w:r/>
-            <w:r>
-              <w:rPr>
-                <w:rFonts w:ascii="Georgia" w:hAnsi="Georgia"/>
-                <w:b w:val="0"/>
-                <w:i w:val="0"/>
-                <w:color w:val="000000"/>
-                <w:sz w:val="17"/>
-              </w:rPr>
-              <w:t>Chinthaluri / Abburi</w:t>
-            </w:r>
-          </w:p>
-        </w:tc>
-      </w:tr>
-      <w:tr>
-        <w:trPr>
-          <w:cantSplit w:val="true"/>
-        </w:trPr>
-        <w:tc>
-          <w:tcPr>
-            <w:tcW w:type="dxa" w:w="1685"/>
-            <w:tcMar>
-              <w:top w:w="40" w:type="dxa"/>
-              <w:bottom w:w="40" w:type="dxa"/>
-              <w:left w:w="110" w:type="dxa"/>
-              <w:right w:w="110" w:type="dxa"/>
-            </w:tcMar>
-            <w:vAlign w:val="center"/>
-          </w:tcPr>
-          <w:p>
-            <w:pPr>
-              <w:spacing w:line="240" w:lineRule="auto" w:after="0"/>
-              <w:jc w:val="left"/>
-            </w:pPr>
-            <w:r/>
-            <w:r>
-              <w:rPr>
-                <w:rFonts w:ascii="Georgia" w:hAnsi="Georgia"/>
-                <w:b w:val="0"/>
-                <w:i w:val="0"/>
-                <w:color w:val="000000"/>
-                <w:sz w:val="17"/>
-              </w:rPr>
-              <w:t>Optimization and evaluation</w:t>
-            </w:r>
-          </w:p>
-        </w:tc>
-        <w:tc>
-          <w:tcPr>
-            <w:tcW w:type="dxa" w:w="2434"/>
-            <w:tcMar>
-              <w:top w:w="40" w:type="dxa"/>
-              <w:bottom w:w="40" w:type="dxa"/>
-              <w:left w:w="110" w:type="dxa"/>
-              <w:right w:w="110" w:type="dxa"/>
-            </w:tcMar>
-            <w:vAlign w:val="center"/>
-          </w:tcPr>
-          <w:p>
-            <w:pPr>
-              <w:spacing w:line="240" w:lineRule="auto" w:after="0"/>
-              <w:jc w:val="left"/>
-            </w:pPr>
-            <w:r/>
-            <w:r>
-              <w:rPr>
-                <w:rFonts w:ascii="Georgia" w:hAnsi="Georgia"/>
-                <w:b w:val="0"/>
-                <w:i w:val="0"/>
-                <w:color w:val="000000"/>
-                <w:sz w:val="17"/>
-              </w:rPr>
-              <w:t>Preliminary Tuning</w:t>
-            </w:r>
-          </w:p>
-        </w:tc>
-        <w:tc>
-          <w:tcPr>
-            <w:tcW w:type="dxa" w:w="3557"/>
-            <w:tcMar>
-              <w:top w:w="40" w:type="dxa"/>
-              <w:bottom w:w="40" w:type="dxa"/>
-              <w:left w:w="110" w:type="dxa"/>
-              <w:right w:w="110" w:type="dxa"/>
-            </w:tcMar>
-            <w:vAlign w:val="center"/>
-          </w:tcPr>
-          <w:p>
-            <w:pPr>
-              <w:spacing w:line="240" w:lineRule="auto" w:after="0"/>
-              <w:jc w:val="left"/>
-            </w:pPr>
-            <w:r/>
-            <w:r>
-              <w:rPr>
-                <w:rFonts w:ascii="Georgia" w:hAnsi="Georgia"/>
-                <w:b w:val="0"/>
-                <w:i w:val="0"/>
-                <w:color w:val="000000"/>
-                <w:sz w:val="17"/>
-              </w:rPr>
-              <w:t>Grouped GridSearchCV on ROC-AUC; Table 4; Figure 8; full optimization in Deliverable 2</w:t>
-            </w:r>
-          </w:p>
-        </w:tc>
-        <w:tc>
-          <w:tcPr>
-            <w:tcW w:type="dxa" w:w="1685"/>
-            <w:tcMar>
-              <w:top w:w="40" w:type="dxa"/>
-              <w:bottom w:w="40" w:type="dxa"/>
-              <w:left w:w="110" w:type="dxa"/>
-              <w:right w:w="110" w:type="dxa"/>
-            </w:tcMar>
-            <w:vAlign w:val="center"/>
-          </w:tcPr>
-          <w:p>
-            <w:pPr>
-              <w:spacing w:line="240" w:lineRule="auto" w:after="0"/>
-              <w:jc w:val="left"/>
-            </w:pPr>
-            <w:r/>
-            <w:r>
-              <w:rPr>
-                <w:rFonts w:ascii="Georgia" w:hAnsi="Georgia"/>
-                <w:b w:val="0"/>
-                <w:i w:val="0"/>
-                <w:color w:val="000000"/>
-                <w:sz w:val="17"/>
-              </w:rPr>
-              <w:t>Chinthaluri / Abburi</w:t>
-            </w:r>
-          </w:p>
-        </w:tc>
-      </w:tr>
-      <w:tr>
-        <w:trPr>
-          <w:cantSplit w:val="true"/>
-        </w:trPr>
-        <w:tc>
-          <w:tcPr>
-            <w:tcW w:type="dxa" w:w="1685"/>
-            <w:tcMar>
-              <w:top w:w="40" w:type="dxa"/>
-              <w:bottom w:w="40" w:type="dxa"/>
-              <w:left w:w="110" w:type="dxa"/>
-              <w:right w:w="110" w:type="dxa"/>
-            </w:tcMar>
-            <w:vAlign w:val="center"/>
-          </w:tcPr>
-          <w:p>
-            <w:pPr>
-              <w:spacing w:line="240" w:lineRule="auto" w:after="0"/>
-              <w:jc w:val="left"/>
-            </w:pPr>
-            <w:r/>
-            <w:r>
-              <w:rPr>
-                <w:rFonts w:ascii="Georgia" w:hAnsi="Georgia"/>
-                <w:b w:val="0"/>
-                <w:i w:val="0"/>
-                <w:color w:val="000000"/>
-                <w:sz w:val="17"/>
-              </w:rPr>
-              <w:t>Ethics and impact</w:t>
-            </w:r>
-          </w:p>
-        </w:tc>
-        <w:tc>
-          <w:tcPr>
-            <w:tcW w:type="dxa" w:w="2434"/>
-            <w:tcMar>
-              <w:top w:w="40" w:type="dxa"/>
-              <w:bottom w:w="40" w:type="dxa"/>
-              <w:left w:w="110" w:type="dxa"/>
-              <w:right w:w="110" w:type="dxa"/>
-            </w:tcMar>
-            <w:vAlign w:val="center"/>
-          </w:tcPr>
-          <w:p>
-            <w:pPr>
-              <w:spacing w:line="240" w:lineRule="auto" w:after="0"/>
-              <w:jc w:val="left"/>
-            </w:pPr>
-            <w:r/>
-            <w:r>
-              <w:rPr>
-                <w:rFonts w:ascii="Georgia" w:hAnsi="Georgia"/>
-                <w:b w:val="0"/>
-                <w:i w:val="0"/>
-                <w:color w:val="000000"/>
-                <w:sz w:val="17"/>
-              </w:rPr>
-              <w:t>Ethical Considerations and Real-World Application</w:t>
-            </w:r>
-          </w:p>
-        </w:tc>
-        <w:tc>
-          <w:tcPr>
-            <w:tcW w:type="dxa" w:w="3557"/>
-            <w:tcMar>
-              <w:top w:w="40" w:type="dxa"/>
-              <w:bottom w:w="40" w:type="dxa"/>
-              <w:left w:w="110" w:type="dxa"/>
-              <w:right w:w="110" w:type="dxa"/>
-            </w:tcMar>
-            <w:vAlign w:val="center"/>
-          </w:tcPr>
-          <w:p>
-            <w:pPr>
-              <w:spacing w:line="240" w:lineRule="auto" w:after="0"/>
-              <w:jc w:val="left"/>
-            </w:pPr>
-            <w:r/>
-            <w:r>
-              <w:rPr>
-                <w:rFonts w:ascii="Georgia" w:hAnsi="Georgia"/>
-                <w:b w:val="0"/>
-                <w:i w:val="0"/>
-                <w:color w:val="000000"/>
-                <w:sz w:val="17"/>
-              </w:rPr>
-              <w:t>Proxy bias, subgroup check (Table 5), transparency, error costs, privacy</w:t>
-            </w:r>
-          </w:p>
-        </w:tc>
-        <w:tc>
-          <w:tcPr>
-            <w:tcW w:type="dxa" w:w="1685"/>
-            <w:tcMar>
-              <w:top w:w="40" w:type="dxa"/>
-              <w:bottom w:w="40" w:type="dxa"/>
-              <w:left w:w="110" w:type="dxa"/>
-              <w:right w:w="110" w:type="dxa"/>
-            </w:tcMar>
-            <w:vAlign w:val="center"/>
-          </w:tcPr>
-          <w:p>
-            <w:pPr>
-              <w:spacing w:line="240" w:lineRule="auto" w:after="0"/>
-              <w:jc w:val="left"/>
-            </w:pPr>
-            <w:r/>
-            <w:r>
-              <w:rPr>
-                <w:rFonts w:ascii="Georgia" w:hAnsi="Georgia"/>
-                <w:b w:val="0"/>
-                <w:i w:val="0"/>
-                <w:color w:val="000000"/>
-                <w:sz w:val="17"/>
-              </w:rPr>
-              <w:t>Abburi / Chinthaluri</w:t>
-            </w:r>
-          </w:p>
-        </w:tc>
-      </w:tr>
-      <w:tr>
-        <w:trPr>
-          <w:cantSplit w:val="true"/>
-        </w:trPr>
-        <w:tc>
-          <w:tcPr>
-            <w:tcW w:type="dxa" w:w="1685"/>
-            <w:tcMar>
-              <w:top w:w="40" w:type="dxa"/>
-              <w:bottom w:w="40" w:type="dxa"/>
-              <w:left w:w="110" w:type="dxa"/>
-              <w:right w:w="110" w:type="dxa"/>
-            </w:tcMar>
-            <w:vAlign w:val="center"/>
-          </w:tcPr>
-          <w:p>
-            <w:pPr>
-              <w:spacing w:line="240" w:lineRule="auto" w:after="0"/>
-              <w:jc w:val="left"/>
-            </w:pPr>
-            <w:r/>
-            <w:r>
-              <w:rPr>
-                <w:rFonts w:ascii="Georgia" w:hAnsi="Georgia"/>
-                <w:b w:val="0"/>
-                <w:i w:val="0"/>
-                <w:color w:val="000000"/>
-                <w:sz w:val="17"/>
-              </w:rPr>
-              <w:t>Real-world application</w:t>
-            </w:r>
-          </w:p>
-        </w:tc>
-        <w:tc>
-          <w:tcPr>
-            <w:tcW w:type="dxa" w:w="2434"/>
-            <w:tcMar>
-              <w:top w:w="40" w:type="dxa"/>
-              <w:bottom w:w="40" w:type="dxa"/>
-              <w:left w:w="110" w:type="dxa"/>
-              <w:right w:w="110" w:type="dxa"/>
-            </w:tcMar>
-            <w:vAlign w:val="center"/>
-          </w:tcPr>
-          <w:p>
-            <w:pPr>
-              <w:spacing w:line="240" w:lineRule="auto" w:after="0"/>
-              <w:jc w:val="left"/>
-            </w:pPr>
-            <w:r/>
-            <w:r>
-              <w:rPr>
-                <w:rFonts w:ascii="Georgia" w:hAnsi="Georgia"/>
-                <w:b w:val="0"/>
-                <w:i w:val="0"/>
-                <w:color w:val="000000"/>
-                <w:sz w:val="17"/>
-              </w:rPr>
-              <w:t>Ethical Considerations and Real-World Application</w:t>
-            </w:r>
-          </w:p>
-        </w:tc>
-        <w:tc>
-          <w:tcPr>
-            <w:tcW w:type="dxa" w:w="3557"/>
-            <w:tcMar>
-              <w:top w:w="40" w:type="dxa"/>
-              <w:bottom w:w="40" w:type="dxa"/>
-              <w:left w:w="110" w:type="dxa"/>
-              <w:right w:w="110" w:type="dxa"/>
-            </w:tcMar>
-            <w:vAlign w:val="center"/>
-          </w:tcPr>
-          <w:p>
-            <w:pPr>
-              <w:spacing w:line="240" w:lineRule="auto" w:after="0"/>
-              <w:jc w:val="left"/>
-            </w:pPr>
-            <w:r/>
-            <w:r>
-              <w:rPr>
-                <w:rFonts w:ascii="Georgia" w:hAnsi="Georgia"/>
-                <w:b w:val="0"/>
-                <w:i w:val="0"/>
-                <w:color w:val="000000"/>
-                <w:sz w:val="17"/>
-              </w:rPr>
-              <w:t>Daily ranked discharge list; 1,000-discharge worked example</w:t>
-            </w:r>
-          </w:p>
-        </w:tc>
-        <w:tc>
-          <w:tcPr>
-            <w:tcW w:type="dxa" w:w="1685"/>
-            <w:tcMar>
-              <w:top w:w="40" w:type="dxa"/>
-              <w:bottom w:w="40" w:type="dxa"/>
-              <w:left w:w="110" w:type="dxa"/>
-              <w:right w:w="110" w:type="dxa"/>
-            </w:tcMar>
-            <w:vAlign w:val="center"/>
-          </w:tcPr>
-          <w:p>
-            <w:pPr>
-              <w:spacing w:line="240" w:lineRule="auto" w:after="0"/>
-              <w:jc w:val="left"/>
-            </w:pPr>
-            <w:r/>
-            <w:r>
-              <w:rPr>
-                <w:rFonts w:ascii="Georgia" w:hAnsi="Georgia"/>
-                <w:b w:val="0"/>
-                <w:i w:val="0"/>
-                <w:color w:val="000000"/>
-                <w:sz w:val="17"/>
-              </w:rPr>
-              <w:t>Abburi / Chinthaluri</w:t>
-            </w:r>
-          </w:p>
-        </w:tc>
-      </w:tr>
-      <w:tr>
-        <w:trPr>
-          <w:cantSplit w:val="true"/>
-        </w:trPr>
-        <w:tc>
-          <w:tcPr>
-            <w:tcW w:type="dxa" w:w="1685"/>
-            <w:tcMar>
-              <w:top w:w="40" w:type="dxa"/>
-              <w:bottom w:w="40" w:type="dxa"/>
-              <w:left w:w="110" w:type="dxa"/>
-              <w:right w:w="110" w:type="dxa"/>
-            </w:tcMar>
-            <w:vAlign w:val="center"/>
-          </w:tcPr>
-          <w:p>
-            <w:pPr>
-              <w:spacing w:line="240" w:lineRule="auto" w:after="0"/>
-              <w:jc w:val="left"/>
-            </w:pPr>
-            <w:r/>
-            <w:r>
-              <w:rPr>
-                <w:rFonts w:ascii="Georgia" w:hAnsi="Georgia"/>
-                <w:b w:val="0"/>
-                <w:i w:val="0"/>
-                <w:color w:val="000000"/>
-                <w:sz w:val="17"/>
-              </w:rPr>
-              <w:t>Teamwork and documentation</w:t>
-            </w:r>
-          </w:p>
-        </w:tc>
-        <w:tc>
-          <w:tcPr>
-            <w:tcW w:type="dxa" w:w="2434"/>
-            <w:tcMar>
-              <w:top w:w="40" w:type="dxa"/>
-              <w:bottom w:w="40" w:type="dxa"/>
-              <w:left w:w="110" w:type="dxa"/>
-              <w:right w:w="110" w:type="dxa"/>
-            </w:tcMar>
-            <w:vAlign w:val="center"/>
-          </w:tcPr>
-          <w:p>
-            <w:pPr>
-              <w:spacing w:line="240" w:lineRule="auto" w:after="0"/>
-              <w:jc w:val="left"/>
-            </w:pPr>
-            <w:r/>
-            <w:r>
-              <w:rPr>
-                <w:rFonts w:ascii="Georgia" w:hAnsi="Georgia"/>
-                <w:b w:val="0"/>
-                <w:i w:val="0"/>
-                <w:color w:val="000000"/>
-                <w:sz w:val="17"/>
-              </w:rPr>
-              <w:t>Team Collaboration Process</w:t>
-            </w:r>
-          </w:p>
-        </w:tc>
-        <w:tc>
-          <w:tcPr>
-            <w:tcW w:type="dxa" w:w="3557"/>
-            <w:tcMar>
-              <w:top w:w="40" w:type="dxa"/>
-              <w:bottom w:w="40" w:type="dxa"/>
-              <w:left w:w="110" w:type="dxa"/>
-              <w:right w:w="110" w:type="dxa"/>
-            </w:tcMar>
-            <w:vAlign w:val="center"/>
-          </w:tcPr>
-          <w:p>
-            <w:pPr>
-              <w:spacing w:line="240" w:lineRule="auto" w:after="0"/>
-              <w:jc w:val="left"/>
-            </w:pPr>
-            <w:r/>
-            <w:r>
-              <w:rPr>
-                <w:rFonts w:ascii="Georgia" w:hAnsi="Georgia"/>
-                <w:b w:val="0"/>
-                <w:i w:val="0"/>
-                <w:color w:val="000000"/>
-                <w:sz w:val="17"/>
-              </w:rPr>
-              <w:t>Table 6; pull-request reviews and Git history; decision log; README</w:t>
-            </w:r>
-          </w:p>
-        </w:tc>
-        <w:tc>
-          <w:tcPr>
-            <w:tcW w:type="dxa" w:w="1685"/>
-            <w:tcMar>
-              <w:top w:w="40" w:type="dxa"/>
-              <w:bottom w:w="40" w:type="dxa"/>
-              <w:left w:w="110" w:type="dxa"/>
-              <w:right w:w="110" w:type="dxa"/>
-            </w:tcMar>
-            <w:vAlign w:val="center"/>
-          </w:tcPr>
-          <w:p>
-            <w:pPr>
-              <w:spacing w:line="240" w:lineRule="auto" w:after="0"/>
-              <w:jc w:val="left"/>
-            </w:pPr>
-            <w:r/>
-            <w:r>
-              <w:rPr>
-                <w:rFonts w:ascii="Georgia" w:hAnsi="Georgia"/>
-                <w:b w:val="0"/>
-                <w:i w:val="0"/>
-                <w:color w:val="000000"/>
-                <w:sz w:val="17"/>
-              </w:rPr>
-              <w:t>Both / Both</w:t>
-            </w:r>
-          </w:p>
-        </w:tc>
-      </w:tr>
-      <w:tr>
-        <w:trPr>
-          <w:cantSplit w:val="true"/>
-        </w:trPr>
-        <w:tc>
-          <w:tcPr>
-            <w:tcW w:type="dxa" w:w="1685"/>
-            <w:tcMar>
-              <w:top w:w="40" w:type="dxa"/>
-              <w:bottom w:w="40" w:type="dxa"/>
-              <w:left w:w="110" w:type="dxa"/>
-              <w:right w:w="110" w:type="dxa"/>
-            </w:tcMar>
-            <w:vAlign w:val="center"/>
-          </w:tcPr>
-          <w:p>
-            <w:pPr>
-              <w:spacing w:line="240" w:lineRule="auto" w:after="0"/>
-              <w:jc w:val="left"/>
-            </w:pPr>
-            <w:r/>
-            <w:r>
-              <w:rPr>
-                <w:rFonts w:ascii="Georgia" w:hAnsi="Georgia"/>
-                <w:b w:val="0"/>
-                <w:i w:val="0"/>
-                <w:color w:val="000000"/>
-                <w:sz w:val="17"/>
-              </w:rPr>
-              <w:t>Writing and structure</w:t>
-            </w:r>
-          </w:p>
-        </w:tc>
-        <w:tc>
-          <w:tcPr>
-            <w:tcW w:type="dxa" w:w="2434"/>
-            <w:tcMar>
-              <w:top w:w="40" w:type="dxa"/>
-              <w:bottom w:w="40" w:type="dxa"/>
-              <w:left w:w="110" w:type="dxa"/>
-              <w:right w:w="110" w:type="dxa"/>
-            </w:tcMar>
-            <w:vAlign w:val="center"/>
-          </w:tcPr>
-          <w:p>
-            <w:pPr>
-              <w:spacing w:line="240" w:lineRule="auto" w:after="0"/>
-              <w:jc w:val="left"/>
-            </w:pPr>
-            <w:r/>
-            <w:r>
-              <w:rPr>
-                <w:rFonts w:ascii="Georgia" w:hAnsi="Georgia"/>
-                <w:b w:val="0"/>
-                <w:i w:val="0"/>
-                <w:color w:val="000000"/>
-                <w:sz w:val="17"/>
-              </w:rPr>
-              <w:t>Whole report</w:t>
-            </w:r>
-          </w:p>
-        </w:tc>
-        <w:tc>
-          <w:tcPr>
-            <w:tcW w:type="dxa" w:w="3557"/>
-            <w:tcMar>
-              <w:top w:w="40" w:type="dxa"/>
-              <w:bottom w:w="40" w:type="dxa"/>
-              <w:left w:w="110" w:type="dxa"/>
-              <w:right w:w="110" w:type="dxa"/>
-            </w:tcMar>
-            <w:vAlign w:val="center"/>
-          </w:tcPr>
-          <w:p>
-            <w:pPr>
-              <w:spacing w:line="240" w:lineRule="auto" w:after="0"/>
-              <w:jc w:val="left"/>
-            </w:pPr>
-            <w:r/>
-            <w:r>
-              <w:rPr>
-                <w:rFonts w:ascii="Georgia" w:hAnsi="Georgia"/>
-                <w:b w:val="0"/>
-                <w:i w:val="0"/>
-                <w:color w:val="000000"/>
-                <w:sz w:val="17"/>
-              </w:rPr>
-              <w:t>APA 7th edition; build checks for citations, callouts, and spelling</w:t>
-            </w:r>
-          </w:p>
-        </w:tc>
-        <w:tc>
-          <w:tcPr>
-            <w:tcW w:type="dxa" w:w="1685"/>
-            <w:tcMar>
-              <w:top w:w="40" w:type="dxa"/>
-              <w:bottom w:w="40" w:type="dxa"/>
-              <w:left w:w="110" w:type="dxa"/>
-              <w:right w:w="110" w:type="dxa"/>
-            </w:tcMar>
-            <w:vAlign w:val="center"/>
-          </w:tcPr>
-          <w:p>
-            <w:pPr>
-              <w:spacing w:line="240" w:lineRule="auto" w:after="0"/>
-              <w:jc w:val="left"/>
-            </w:pPr>
-            <w:r/>
-            <w:r>
-              <w:rPr>
-                <w:rFonts w:ascii="Georgia" w:hAnsi="Georgia"/>
-                <w:b w:val="0"/>
-                <w:i w:val="0"/>
-                <w:color w:val="000000"/>
-                <w:sz w:val="17"/>
-              </w:rPr>
-              <w:t>Both / Abburi (proofread)</w:t>
-            </w:r>
-          </w:p>
-        </w:tc>
-      </w:tr>
-    </w:tbl>
-    <w:p>
-      <w:pPr>
-        <w:keepNext/>
-        <w:keepLines/>
-        <w:spacing w:line="480" w:lineRule="auto" w:after="0" w:before="120"/>
-      </w:pPr>
-      <w:r>
-        <w:rPr>
-          <w:rFonts w:ascii="Georgia" w:hAnsi="Georgia"/>
-          <w:b/>
-          <w:i w:val="0"/>
-          <w:color w:val="000000"/>
-          <w:sz w:val="22"/>
-        </w:rPr>
-        <w:t>Table A2</w:t>
       </w:r>
     </w:p>
     <w:p>

</xml_diff>

<commit_message>
Explain each method choice on its own terms; keep course files out of the repo
- Notebook: drop the section-mapping table from the header and state each
  choice by its reason (patient-level rows, leakage, the accuracy trap); code
  and outputs are unchanged, only text and comments
- Report: Appendix A now holds only the Colab link; the model and tuning
  text justify the random forest and the grid directly
- README: a short "Safeguards against misleading results" note
- Course handout no longer tracked
</commit_message>
<xml_diff>
--- a/Diabetes_Readmission_Deliverable1_Chinthaluri_Abburi.docx
+++ b/Diabetes_Readmission_Deliverable1_Chinthaluri_Abburi.docx
@@ -2823,7 +2823,7 @@
           <w:color w:val="000000"/>
           <w:sz w:val="22"/>
         </w:rPr>
-        <w:t>The initial model is an L2-regularized logistic regression with balanced class weights. It is the reference standard for clinical prediction (Steyerberg, 2019), its coefficients can be inspected when a score allocates care (Rudin, 2019), and established readmission indices such as LACE are themselves additive risk scores (van Walraven et al., 2010). A random forest (Breiman, 2001) at default settings serves as the nonlinear comparison the course guidance suggests. Data were split 75/25 by patient, five-fold stratified group cross-validation was run on the training set, and a prior-rate dummy and a prior-admissions heuristic anchor the results.</w:t>
+        <w:t>The initial model is an L2-regularized logistic regression with balanced class weights. It is the reference standard for clinical prediction (Steyerberg, 2019), its coefficients can be inspected when a score allocates care (Rudin, 2019), and established readmission indices such as LACE are themselves additive risk scores (van Walraven et al., 2010). A random forest (Breiman, 2001) at default settings serves as a nonlinear comparison that can capture interactions the linear model misses. Data were split 75/25 by patient, five-fold stratified group cross-validation was run on the training set, and a prior-rate dummy and a prior-admissions heuristic anchor the results.</w:t>
       </w:r>
     </w:p>
     <w:p>
@@ -4832,7 +4832,7 @@
           <w:color w:val="000000"/>
           <w:sz w:val="22"/>
         </w:rPr>
-        <w:t>Following the course hints, GridSearchCV tuned both models (Table 4, Figure 8), with two corrections: folds were grouped by patient, and scoring used ROC-AUC, because accuracy rewards the do-nothing behavior shown above. Limiting tree depth raised the forest's test AUC from .635 to .665, whereas the logistic regression barely moved (.661 to .662), because its discrimination is nearly flat across the penalty grid. The tuned forest and the logistic regression are statistically indistinguishable (difference 95% CI [−.001, .008]), so the interpretable model remains the working choice (Rudin, 2019). Class weighting also inflated the mean predicted risk to .469 against an observed test-set rate of .113, so Deliverable 2 will calibrate scores and set thresholds from program capacity.</w:t>
+        <w:t>GridSearchCV tuned both models (Table 4, Figure 8) on folds grouped by patient and scored on ROC-AUC, because accuracy rewards the do-nothing behavior shown above. Limiting tree depth raised the forest's test AUC from .635 to .665, whereas the logistic regression barely moved (.661 to .662), because its discrimination is nearly flat across the penalty grid. The tuned forest and the logistic regression are statistically indistinguishable (difference 95% CI [−.001, .008]), so the interpretable model remains the working choice (Rudin, 2019). Class weighting also inflated the mean predicted risk to .469 against an observed test-set rate of .113, so Deliverable 2 will calibrate scores and set thresholds from program capacity.</w:t>
       </w:r>
     </w:p>
     <w:p>
@@ -5561,7 +5561,7 @@
           <w:color w:val="000000"/>
           <w:sz w:val="17"/>
         </w:rPr>
-        <w:t>GridSearchCV with three patient-grouped, stratified folds and ROC-AUC scoring; the forest grid follows the course hints. Test metrics use the same patient-disjoint test set as Table 3.</w:t>
+        <w:t>GridSearchCV with three patient-grouped, stratified folds and ROC-AUC scoring; the forest grid varies the number of trees and the maximum depth. Test metrics use the same patient-disjoint test set as Table 3.</w:t>
       </w:r>
     </w:p>
     <w:p>
@@ -8896,7 +8896,7 @@
           <w:color w:val="000000"/>
           <w:sz w:val="22"/>
         </w:rPr>
-        <w:t>Google Colab Notebook and Course-Hints Map</w:t>
+        <w:t>Google Colab Notebook</w:t>
       </w:r>
     </w:p>
     <w:p>
@@ -8940,900 +8940,9 @@
           <w:color w:val="000000"/>
           <w:sz w:val="22"/>
         </w:rPr>
-        <w:t>The notebook (Diabetes_Readmission_D1_Chinthaluri_Abburi.ipynb) is self-contained: on first run it downloads the UCI archive, then executes top to bottom and writes every figure and reported number. Table A1 shows how each course hint was followed, including the three applied in corrected form.</w:t>
+        <w:t>The notebook (Diabetes_Readmission_D1_Chinthaluri_Abburi.ipynb) is self-contained: on first run it downloads the UCI archive, then executes top to bottom and writes every figure and reported number.</w:t>
       </w:r>
     </w:p>
-    <w:p>
-      <w:pPr>
-        <w:keepNext/>
-        <w:keepLines/>
-        <w:spacing w:line="480" w:lineRule="auto" w:after="0" w:before="120"/>
-      </w:pPr>
-      <w:r>
-        <w:rPr>
-          <w:rFonts w:ascii="Georgia" w:hAnsi="Georgia"/>
-          <w:b/>
-          <w:i w:val="0"/>
-          <w:color w:val="000000"/>
-          <w:sz w:val="22"/>
-        </w:rPr>
-        <w:t>Table A1</w:t>
-      </w:r>
-    </w:p>
-    <w:p>
-      <w:pPr>
-        <w:keepNext/>
-        <w:keepLines/>
-        <w:spacing w:line="480" w:lineRule="auto" w:after="0"/>
-      </w:pPr>
-      <w:r>
-        <w:rPr>
-          <w:rFonts w:ascii="Georgia" w:hAnsi="Georgia"/>
-          <w:b w:val="0"/>
-          <w:i/>
-          <w:color w:val="000000"/>
-          <w:sz w:val="22"/>
-        </w:rPr>
-        <w:t>Course Hints and How the Notebook Follows Them</w:t>
-      </w:r>
-    </w:p>
-    <w:tbl>
-      <w:tblPr>
-        <w:tblW w:type="auto" w:w="0"/>
-        <w:tblLayout w:type="fixed"/>
-        <w:tblLook w:firstColumn="1" w:firstRow="1" w:lastColumn="0" w:lastRow="0" w:noHBand="0" w:noVBand="1" w:val="04A0"/>
-        <w:tblBorders>
-          <w:top w:val="single" w:sz="6" w:color="000000"/>
-          <w:bottom w:val="single" w:sz="6" w:color="000000"/>
-          <w:left w:val="none"/>
-          <w:right w:val="none"/>
-          <w:insideH w:val="none"/>
-          <w:insideV w:val="none"/>
-        </w:tblBorders>
-      </w:tblPr>
-      <w:tblGrid>
-        <w:gridCol w:w="3120"/>
-        <w:gridCol w:w="3120"/>
-        <w:gridCol w:w="3120"/>
-      </w:tblGrid>
-      <w:tr>
-        <w:trPr>
-          <w:cantSplit w:val="true"/>
-        </w:trPr>
-        <w:tc>
-          <w:tcPr>
-            <w:tcW w:type="dxa" w:w="2434"/>
-            <w:tcBorders>
-              <w:bottom w:val="single" w:sz="6" w:color="000000"/>
-            </w:tcBorders>
-            <w:tcMar>
-              <w:top w:w="40" w:type="dxa"/>
-              <w:bottom w:w="40" w:type="dxa"/>
-              <w:left w:w="110" w:type="dxa"/>
-              <w:right w:w="110" w:type="dxa"/>
-            </w:tcMar>
-            <w:vAlign w:val="center"/>
-          </w:tcPr>
-          <w:p>
-            <w:pPr>
-              <w:spacing w:line="240" w:lineRule="auto" w:after="0"/>
-              <w:jc w:val="left"/>
-            </w:pPr>
-            <w:r/>
-            <w:r>
-              <w:rPr>
-                <w:rFonts w:ascii="Georgia" w:hAnsi="Georgia"/>
-                <w:b/>
-                <w:i w:val="0"/>
-                <w:color w:val="000000"/>
-                <w:sz w:val="18"/>
-              </w:rPr>
-              <w:t>Hint</w:t>
-            </w:r>
-          </w:p>
-        </w:tc>
-        <w:tc>
-          <w:tcPr>
-            <w:tcW w:type="dxa" w:w="1310"/>
-            <w:tcBorders>
-              <w:bottom w:val="single" w:sz="6" w:color="000000"/>
-            </w:tcBorders>
-            <w:tcMar>
-              <w:top w:w="40" w:type="dxa"/>
-              <w:bottom w:w="40" w:type="dxa"/>
-              <w:left w:w="110" w:type="dxa"/>
-              <w:right w:w="110" w:type="dxa"/>
-            </w:tcMar>
-            <w:vAlign w:val="center"/>
-          </w:tcPr>
-          <w:p>
-            <w:pPr>
-              <w:spacing w:line="240" w:lineRule="auto" w:after="0"/>
-              <w:jc w:val="left"/>
-            </w:pPr>
-            <w:r/>
-            <w:r>
-              <w:rPr>
-                <w:rFonts w:ascii="Georgia" w:hAnsi="Georgia"/>
-                <w:b/>
-                <w:i w:val="0"/>
-                <w:color w:val="000000"/>
-                <w:sz w:val="18"/>
-              </w:rPr>
-              <w:t>Notebook section</w:t>
-            </w:r>
-          </w:p>
-        </w:tc>
-        <w:tc>
-          <w:tcPr>
-            <w:tcW w:type="dxa" w:w="5616"/>
-            <w:tcBorders>
-              <w:bottom w:val="single" w:sz="6" w:color="000000"/>
-            </w:tcBorders>
-            <w:tcMar>
-              <w:top w:w="40" w:type="dxa"/>
-              <w:bottom w:w="40" w:type="dxa"/>
-              <w:left w:w="110" w:type="dxa"/>
-              <w:right w:w="110" w:type="dxa"/>
-            </w:tcMar>
-            <w:vAlign w:val="center"/>
-          </w:tcPr>
-          <w:p>
-            <w:pPr>
-              <w:spacing w:line="240" w:lineRule="auto" w:after="0"/>
-              <w:jc w:val="left"/>
-            </w:pPr>
-            <w:r/>
-            <w:r>
-              <w:rPr>
-                <w:rFonts w:ascii="Georgia" w:hAnsi="Georgia"/>
-                <w:b/>
-                <w:i w:val="0"/>
-                <w:color w:val="000000"/>
-                <w:sz w:val="18"/>
-              </w:rPr>
-              <w:t>How it is applied</w:t>
-            </w:r>
-          </w:p>
-        </w:tc>
-      </w:tr>
-      <w:tr>
-        <w:trPr>
-          <w:cantSplit w:val="true"/>
-        </w:trPr>
-        <w:tc>
-          <w:tcPr>
-            <w:tcW w:type="dxa" w:w="2434"/>
-            <w:tcMar>
-              <w:top w:w="40" w:type="dxa"/>
-              <w:bottom w:w="40" w:type="dxa"/>
-              <w:left w:w="110" w:type="dxa"/>
-              <w:right w:w="110" w:type="dxa"/>
-            </w:tcMar>
-            <w:vAlign w:val="center"/>
-          </w:tcPr>
-          <w:p>
-            <w:pPr>
-              <w:spacing w:line="240" w:lineRule="auto" w:after="0"/>
-              <w:jc w:val="left"/>
-            </w:pPr>
-            <w:r/>
-            <w:r>
-              <w:rPr>
-                <w:rFonts w:ascii="Georgia" w:hAnsi="Georgia"/>
-                <w:b w:val="0"/>
-                <w:i w:val="0"/>
-                <w:color w:val="000000"/>
-                <w:sz w:val="18"/>
-              </w:rPr>
-              <w:t>1. Setup and imports</w:t>
-            </w:r>
-          </w:p>
-        </w:tc>
-        <w:tc>
-          <w:tcPr>
-            <w:tcW w:type="dxa" w:w="1310"/>
-            <w:tcMar>
-              <w:top w:w="40" w:type="dxa"/>
-              <w:bottom w:w="40" w:type="dxa"/>
-              <w:left w:w="110" w:type="dxa"/>
-              <w:right w:w="110" w:type="dxa"/>
-            </w:tcMar>
-            <w:vAlign w:val="center"/>
-          </w:tcPr>
-          <w:p>
-            <w:pPr>
-              <w:spacing w:line="240" w:lineRule="auto" w:after="0"/>
-              <w:jc w:val="left"/>
-            </w:pPr>
-            <w:r/>
-            <w:r>
-              <w:rPr>
-                <w:rFonts w:ascii="Georgia" w:hAnsi="Georgia"/>
-                <w:b w:val="0"/>
-                <w:i w:val="0"/>
-                <w:color w:val="000000"/>
-                <w:sz w:val="18"/>
-              </w:rPr>
-              <w:t>1</w:t>
-            </w:r>
-          </w:p>
-        </w:tc>
-        <w:tc>
-          <w:tcPr>
-            <w:tcW w:type="dxa" w:w="5616"/>
-            <w:tcMar>
-              <w:top w:w="40" w:type="dxa"/>
-              <w:bottom w:w="40" w:type="dxa"/>
-              <w:left w:w="110" w:type="dxa"/>
-              <w:right w:w="110" w:type="dxa"/>
-            </w:tcMar>
-            <w:vAlign w:val="center"/>
-          </w:tcPr>
-          <w:p>
-            <w:pPr>
-              <w:spacing w:line="240" w:lineRule="auto" w:after="0"/>
-              <w:jc w:val="left"/>
-            </w:pPr>
-            <w:r/>
-            <w:r>
-              <w:rPr>
-                <w:rFonts w:ascii="Georgia" w:hAnsi="Georgia"/>
-                <w:b w:val="0"/>
-                <w:i w:val="0"/>
-                <w:color w:val="000000"/>
-                <w:sz w:val="18"/>
-              </w:rPr>
-              <w:t>pandas, NumPy, Matplotlib, seaborn, scikit-learn, GridSearchCV; warnings suppressed</w:t>
-            </w:r>
-          </w:p>
-        </w:tc>
-      </w:tr>
-      <w:tr>
-        <w:trPr>
-          <w:cantSplit w:val="true"/>
-        </w:trPr>
-        <w:tc>
-          <w:tcPr>
-            <w:tcW w:type="dxa" w:w="2434"/>
-            <w:tcMar>
-              <w:top w:w="40" w:type="dxa"/>
-              <w:bottom w:w="40" w:type="dxa"/>
-              <w:left w:w="110" w:type="dxa"/>
-              <w:right w:w="110" w:type="dxa"/>
-            </w:tcMar>
-            <w:vAlign w:val="center"/>
-          </w:tcPr>
-          <w:p>
-            <w:pPr>
-              <w:spacing w:line="240" w:lineRule="auto" w:after="0"/>
-              <w:jc w:val="left"/>
-            </w:pPr>
-            <w:r/>
-            <w:r>
-              <w:rPr>
-                <w:rFonts w:ascii="Georgia" w:hAnsi="Georgia"/>
-                <w:b w:val="0"/>
-                <w:i w:val="0"/>
-                <w:color w:val="000000"/>
-                <w:sz w:val="18"/>
-              </w:rPr>
-              <w:t>2. Uploading or accessing data</w:t>
-            </w:r>
-          </w:p>
-        </w:tc>
-        <w:tc>
-          <w:tcPr>
-            <w:tcW w:type="dxa" w:w="1310"/>
-            <w:tcMar>
-              <w:top w:w="40" w:type="dxa"/>
-              <w:bottom w:w="40" w:type="dxa"/>
-              <w:left w:w="110" w:type="dxa"/>
-              <w:right w:w="110" w:type="dxa"/>
-            </w:tcMar>
-            <w:vAlign w:val="center"/>
-          </w:tcPr>
-          <w:p>
-            <w:pPr>
-              <w:spacing w:line="240" w:lineRule="auto" w:after="0"/>
-              <w:jc w:val="left"/>
-            </w:pPr>
-            <w:r/>
-            <w:r>
-              <w:rPr>
-                <w:rFonts w:ascii="Georgia" w:hAnsi="Georgia"/>
-                <w:b w:val="0"/>
-                <w:i w:val="0"/>
-                <w:color w:val="000000"/>
-                <w:sz w:val="18"/>
-              </w:rPr>
-              <w:t>2</w:t>
-            </w:r>
-          </w:p>
-        </w:tc>
-        <w:tc>
-          <w:tcPr>
-            <w:tcW w:type="dxa" w:w="5616"/>
-            <w:tcMar>
-              <w:top w:w="40" w:type="dxa"/>
-              <w:bottom w:w="40" w:type="dxa"/>
-              <w:left w:w="110" w:type="dxa"/>
-              <w:right w:w="110" w:type="dxa"/>
-            </w:tcMar>
-            <w:vAlign w:val="center"/>
-          </w:tcPr>
-          <w:p>
-            <w:pPr>
-              <w:spacing w:line="240" w:lineRule="auto" w:after="0"/>
-              <w:jc w:val="left"/>
-            </w:pPr>
-            <w:r/>
-            <w:r>
-              <w:rPr>
-                <w:rFonts w:ascii="Georgia" w:hAnsi="Georgia"/>
-                <w:b w:val="0"/>
-                <w:i w:val="0"/>
-                <w:color w:val="000000"/>
-                <w:sz w:val="18"/>
-              </w:rPr>
-              <w:t>Downloaded by URL, with files.upload() as fallback</w:t>
-            </w:r>
-          </w:p>
-        </w:tc>
-      </w:tr>
-      <w:tr>
-        <w:trPr>
-          <w:cantSplit w:val="true"/>
-        </w:trPr>
-        <w:tc>
-          <w:tcPr>
-            <w:tcW w:type="dxa" w:w="2434"/>
-            <w:tcMar>
-              <w:top w:w="40" w:type="dxa"/>
-              <w:bottom w:w="40" w:type="dxa"/>
-              <w:left w:w="110" w:type="dxa"/>
-              <w:right w:w="110" w:type="dxa"/>
-            </w:tcMar>
-            <w:vAlign w:val="center"/>
-          </w:tcPr>
-          <w:p>
-            <w:pPr>
-              <w:spacing w:line="240" w:lineRule="auto" w:after="0"/>
-              <w:jc w:val="left"/>
-            </w:pPr>
-            <w:r/>
-            <w:r>
-              <w:rPr>
-                <w:rFonts w:ascii="Georgia" w:hAnsi="Georgia"/>
-                <w:b w:val="0"/>
-                <w:i w:val="0"/>
-                <w:color w:val="000000"/>
-                <w:sz w:val="18"/>
-              </w:rPr>
-              <w:t>3. Exploration and cleaning</w:t>
-            </w:r>
-          </w:p>
-        </w:tc>
-        <w:tc>
-          <w:tcPr>
-            <w:tcW w:type="dxa" w:w="1310"/>
-            <w:tcMar>
-              <w:top w:w="40" w:type="dxa"/>
-              <w:bottom w:w="40" w:type="dxa"/>
-              <w:left w:w="110" w:type="dxa"/>
-              <w:right w:w="110" w:type="dxa"/>
-            </w:tcMar>
-            <w:vAlign w:val="center"/>
-          </w:tcPr>
-          <w:p>
-            <w:pPr>
-              <w:spacing w:line="240" w:lineRule="auto" w:after="0"/>
-              <w:jc w:val="left"/>
-            </w:pPr>
-            <w:r/>
-            <w:r>
-              <w:rPr>
-                <w:rFonts w:ascii="Georgia" w:hAnsi="Georgia"/>
-                <w:b w:val="0"/>
-                <w:i w:val="0"/>
-                <w:color w:val="000000"/>
-                <w:sz w:val="18"/>
-              </w:rPr>
-              <w:t>3–4, 6</w:t>
-            </w:r>
-          </w:p>
-        </w:tc>
-        <w:tc>
-          <w:tcPr>
-            <w:tcW w:type="dxa" w:w="5616"/>
-            <w:tcMar>
-              <w:top w:w="40" w:type="dxa"/>
-              <w:bottom w:w="40" w:type="dxa"/>
-              <w:left w:w="110" w:type="dxa"/>
-              <w:right w:w="110" w:type="dxa"/>
-            </w:tcMar>
-            <w:vAlign w:val="center"/>
-          </w:tcPr>
-          <w:p>
-            <w:pPr>
-              <w:spacing w:line="240" w:lineRule="auto" w:after="0"/>
-              <w:jc w:val="left"/>
-            </w:pPr>
-            <w:r/>
-            <w:r>
-              <w:rPr>
-                <w:rFonts w:ascii="Georgia" w:hAnsi="Georgia"/>
-                <w:b w:val="0"/>
-                <w:i w:val="0"/>
-                <w:color w:val="000000"/>
-                <w:sz w:val="18"/>
-              </w:rPr>
-              <w:t>shape, info(), describe(), countplot, histograms, heatmap, drop_duplicates(); missing values handled per column instead of forward fill, which would copy values between different patients</w:t>
-            </w:r>
-          </w:p>
-        </w:tc>
-      </w:tr>
-      <w:tr>
-        <w:trPr>
-          <w:cantSplit w:val="true"/>
-        </w:trPr>
-        <w:tc>
-          <w:tcPr>
-            <w:tcW w:type="dxa" w:w="2434"/>
-            <w:tcMar>
-              <w:top w:w="40" w:type="dxa"/>
-              <w:bottom w:w="40" w:type="dxa"/>
-              <w:left w:w="110" w:type="dxa"/>
-              <w:right w:w="110" w:type="dxa"/>
-            </w:tcMar>
-            <w:vAlign w:val="center"/>
-          </w:tcPr>
-          <w:p>
-            <w:pPr>
-              <w:spacing w:line="240" w:lineRule="auto" w:after="0"/>
-              <w:jc w:val="left"/>
-            </w:pPr>
-            <w:r/>
-            <w:r>
-              <w:rPr>
-                <w:rFonts w:ascii="Georgia" w:hAnsi="Georgia"/>
-                <w:b w:val="0"/>
-                <w:i w:val="0"/>
-                <w:color w:val="000000"/>
-                <w:sz w:val="18"/>
-              </w:rPr>
-              <w:t>4. Feature engineering and preprocessing</w:t>
-            </w:r>
-          </w:p>
-        </w:tc>
-        <w:tc>
-          <w:tcPr>
-            <w:tcW w:type="dxa" w:w="1310"/>
-            <w:tcMar>
-              <w:top w:w="40" w:type="dxa"/>
-              <w:bottom w:w="40" w:type="dxa"/>
-              <w:left w:w="110" w:type="dxa"/>
-              <w:right w:w="110" w:type="dxa"/>
-            </w:tcMar>
-            <w:vAlign w:val="center"/>
-          </w:tcPr>
-          <w:p>
-            <w:pPr>
-              <w:spacing w:line="240" w:lineRule="auto" w:after="0"/>
-              <w:jc w:val="left"/>
-            </w:pPr>
-            <w:r/>
-            <w:r>
-              <w:rPr>
-                <w:rFonts w:ascii="Georgia" w:hAnsi="Georgia"/>
-                <w:b w:val="0"/>
-                <w:i w:val="0"/>
-                <w:color w:val="000000"/>
-                <w:sz w:val="18"/>
-              </w:rPr>
-              <w:t>5, 7</w:t>
-            </w:r>
-          </w:p>
-        </w:tc>
-        <w:tc>
-          <w:tcPr>
-            <w:tcW w:type="dxa" w:w="5616"/>
-            <w:tcMar>
-              <w:top w:w="40" w:type="dxa"/>
-              <w:bottom w:w="40" w:type="dxa"/>
-              <w:left w:w="110" w:type="dxa"/>
-              <w:right w:w="110" w:type="dxa"/>
-            </w:tcMar>
-            <w:vAlign w:val="center"/>
-          </w:tcPr>
-          <w:p>
-            <w:pPr>
-              <w:spacing w:line="240" w:lineRule="auto" w:after="0"/>
-              <w:jc w:val="left"/>
-            </w:pPr>
-            <w:r/>
-            <w:r>
-              <w:rPr>
-                <w:rFonts w:ascii="Georgia" w:hAnsi="Georgia"/>
-                <w:b w:val="0"/>
-                <w:i w:val="0"/>
-                <w:color w:val="000000"/>
-                <w:sz w:val="18"/>
-              </w:rPr>
-              <w:t>One-hot encoding and StandardScaler fit after the split inside a Pipeline, not on the full data, to prevent leakage</w:t>
-            </w:r>
-          </w:p>
-        </w:tc>
-      </w:tr>
-      <w:tr>
-        <w:trPr>
-          <w:cantSplit w:val="true"/>
-        </w:trPr>
-        <w:tc>
-          <w:tcPr>
-            <w:tcW w:type="dxa" w:w="2434"/>
-            <w:tcMar>
-              <w:top w:w="40" w:type="dxa"/>
-              <w:bottom w:w="40" w:type="dxa"/>
-              <w:left w:w="110" w:type="dxa"/>
-              <w:right w:w="110" w:type="dxa"/>
-            </w:tcMar>
-            <w:vAlign w:val="center"/>
-          </w:tcPr>
-          <w:p>
-            <w:pPr>
-              <w:spacing w:line="240" w:lineRule="auto" w:after="0"/>
-              <w:jc w:val="left"/>
-            </w:pPr>
-            <w:r/>
-            <w:r>
-              <w:rPr>
-                <w:rFonts w:ascii="Georgia" w:hAnsi="Georgia"/>
-                <w:b w:val="0"/>
-                <w:i w:val="0"/>
-                <w:color w:val="000000"/>
-                <w:sz w:val="18"/>
-              </w:rPr>
-              <w:t>5. Train-test split</w:t>
-            </w:r>
-          </w:p>
-        </w:tc>
-        <w:tc>
-          <w:tcPr>
-            <w:tcW w:type="dxa" w:w="1310"/>
-            <w:tcMar>
-              <w:top w:w="40" w:type="dxa"/>
-              <w:bottom w:w="40" w:type="dxa"/>
-              <w:left w:w="110" w:type="dxa"/>
-              <w:right w:w="110" w:type="dxa"/>
-            </w:tcMar>
-            <w:vAlign w:val="center"/>
-          </w:tcPr>
-          <w:p>
-            <w:pPr>
-              <w:spacing w:line="240" w:lineRule="auto" w:after="0"/>
-              <w:jc w:val="left"/>
-            </w:pPr>
-            <w:r/>
-            <w:r>
-              <w:rPr>
-                <w:rFonts w:ascii="Georgia" w:hAnsi="Georgia"/>
-                <w:b w:val="0"/>
-                <w:i w:val="0"/>
-                <w:color w:val="000000"/>
-                <w:sz w:val="18"/>
-              </w:rPr>
-              <w:t>7</w:t>
-            </w:r>
-          </w:p>
-        </w:tc>
-        <w:tc>
-          <w:tcPr>
-            <w:tcW w:type="dxa" w:w="5616"/>
-            <w:tcMar>
-              <w:top w:w="40" w:type="dxa"/>
-              <w:bottom w:w="40" w:type="dxa"/>
-              <w:left w:w="110" w:type="dxa"/>
-              <w:right w:w="110" w:type="dxa"/>
-            </w:tcMar>
-            <w:vAlign w:val="center"/>
-          </w:tcPr>
-          <w:p>
-            <w:pPr>
-              <w:spacing w:line="240" w:lineRule="auto" w:after="0"/>
-              <w:jc w:val="left"/>
-            </w:pPr>
-            <w:r/>
-            <w:r>
-              <w:rPr>
-                <w:rFonts w:ascii="Georgia" w:hAnsi="Georgia"/>
-                <w:b w:val="0"/>
-                <w:i w:val="0"/>
-                <w:color w:val="000000"/>
-                <w:sz w:val="18"/>
-              </w:rPr>
-              <w:t>75/25 with random_state = 42, grouped by patient</w:t>
-            </w:r>
-          </w:p>
-        </w:tc>
-      </w:tr>
-      <w:tr>
-        <w:trPr>
-          <w:cantSplit w:val="true"/>
-        </w:trPr>
-        <w:tc>
-          <w:tcPr>
-            <w:tcW w:type="dxa" w:w="2434"/>
-            <w:tcMar>
-              <w:top w:w="40" w:type="dxa"/>
-              <w:bottom w:w="40" w:type="dxa"/>
-              <w:left w:w="110" w:type="dxa"/>
-              <w:right w:w="110" w:type="dxa"/>
-            </w:tcMar>
-            <w:vAlign w:val="center"/>
-          </w:tcPr>
-          <w:p>
-            <w:pPr>
-              <w:spacing w:line="240" w:lineRule="auto" w:after="0"/>
-              <w:jc w:val="left"/>
-            </w:pPr>
-            <w:r/>
-            <w:r>
-              <w:rPr>
-                <w:rFonts w:ascii="Georgia" w:hAnsi="Georgia"/>
-                <w:b w:val="0"/>
-                <w:i w:val="0"/>
-                <w:color w:val="000000"/>
-                <w:sz w:val="18"/>
-              </w:rPr>
-              <w:t>6. Model training and evaluation</w:t>
-            </w:r>
-          </w:p>
-        </w:tc>
-        <w:tc>
-          <w:tcPr>
-            <w:tcW w:type="dxa" w:w="1310"/>
-            <w:tcMar>
-              <w:top w:w="40" w:type="dxa"/>
-              <w:bottom w:w="40" w:type="dxa"/>
-              <w:left w:w="110" w:type="dxa"/>
-              <w:right w:w="110" w:type="dxa"/>
-            </w:tcMar>
-            <w:vAlign w:val="center"/>
-          </w:tcPr>
-          <w:p>
-            <w:pPr>
-              <w:spacing w:line="240" w:lineRule="auto" w:after="0"/>
-              <w:jc w:val="left"/>
-            </w:pPr>
-            <w:r/>
-            <w:r>
-              <w:rPr>
-                <w:rFonts w:ascii="Georgia" w:hAnsi="Georgia"/>
-                <w:b w:val="0"/>
-                <w:i w:val="0"/>
-                <w:color w:val="000000"/>
-                <w:sz w:val="18"/>
-              </w:rPr>
-              <w:t>8–11</w:t>
-            </w:r>
-          </w:p>
-        </w:tc>
-        <w:tc>
-          <w:tcPr>
-            <w:tcW w:type="dxa" w:w="5616"/>
-            <w:tcMar>
-              <w:top w:w="40" w:type="dxa"/>
-              <w:bottom w:w="40" w:type="dxa"/>
-              <w:left w:w="110" w:type="dxa"/>
-              <w:right w:w="110" w:type="dxa"/>
-            </w:tcMar>
-            <w:vAlign w:val="center"/>
-          </w:tcPr>
-          <w:p>
-            <w:pPr>
-              <w:spacing w:line="240" w:lineRule="auto" w:after="0"/>
-              <w:jc w:val="left"/>
-            </w:pPr>
-            <w:r/>
-            <w:r>
-              <w:rPr>
-                <w:rFonts w:ascii="Georgia" w:hAnsi="Georgia"/>
-                <w:b w:val="0"/>
-                <w:i w:val="0"/>
-                <w:color w:val="000000"/>
-                <w:sz w:val="18"/>
-              </w:rPr>
-              <w:t>Logistic regression and RandomForestClassifier; classification_report; confusion-matrix heatmaps</w:t>
-            </w:r>
-          </w:p>
-        </w:tc>
-      </w:tr>
-      <w:tr>
-        <w:trPr>
-          <w:cantSplit w:val="true"/>
-        </w:trPr>
-        <w:tc>
-          <w:tcPr>
-            <w:tcW w:type="dxa" w:w="2434"/>
-            <w:tcMar>
-              <w:top w:w="40" w:type="dxa"/>
-              <w:bottom w:w="40" w:type="dxa"/>
-              <w:left w:w="110" w:type="dxa"/>
-              <w:right w:w="110" w:type="dxa"/>
-            </w:tcMar>
-            <w:vAlign w:val="center"/>
-          </w:tcPr>
-          <w:p>
-            <w:pPr>
-              <w:spacing w:line="240" w:lineRule="auto" w:after="0"/>
-              <w:jc w:val="left"/>
-            </w:pPr>
-            <w:r/>
-            <w:r>
-              <w:rPr>
-                <w:rFonts w:ascii="Georgia" w:hAnsi="Georgia"/>
-                <w:b w:val="0"/>
-                <w:i w:val="0"/>
-                <w:color w:val="000000"/>
-                <w:sz w:val="18"/>
-              </w:rPr>
-              <w:t>7. Hyperparameter tuning</w:t>
-            </w:r>
-          </w:p>
-        </w:tc>
-        <w:tc>
-          <w:tcPr>
-            <w:tcW w:type="dxa" w:w="1310"/>
-            <w:tcMar>
-              <w:top w:w="40" w:type="dxa"/>
-              <w:bottom w:w="40" w:type="dxa"/>
-              <w:left w:w="110" w:type="dxa"/>
-              <w:right w:w="110" w:type="dxa"/>
-            </w:tcMar>
-            <w:vAlign w:val="center"/>
-          </w:tcPr>
-          <w:p>
-            <w:pPr>
-              <w:spacing w:line="240" w:lineRule="auto" w:after="0"/>
-              <w:jc w:val="left"/>
-            </w:pPr>
-            <w:r/>
-            <w:r>
-              <w:rPr>
-                <w:rFonts w:ascii="Georgia" w:hAnsi="Georgia"/>
-                <w:b w:val="0"/>
-                <w:i w:val="0"/>
-                <w:color w:val="000000"/>
-                <w:sz w:val="18"/>
-              </w:rPr>
-              <w:t>12</w:t>
-            </w:r>
-          </w:p>
-        </w:tc>
-        <w:tc>
-          <w:tcPr>
-            <w:tcW w:type="dxa" w:w="5616"/>
-            <w:tcMar>
-              <w:top w:w="40" w:type="dxa"/>
-              <w:bottom w:w="40" w:type="dxa"/>
-              <w:left w:w="110" w:type="dxa"/>
-              <w:right w:w="110" w:type="dxa"/>
-            </w:tcMar>
-            <w:vAlign w:val="center"/>
-          </w:tcPr>
-          <w:p>
-            <w:pPr>
-              <w:spacing w:line="240" w:lineRule="auto" w:after="0"/>
-              <w:jc w:val="left"/>
-            </w:pPr>
-            <w:r/>
-            <w:r>
-              <w:rPr>
-                <w:rFonts w:ascii="Georgia" w:hAnsi="Georgia"/>
-                <w:b w:val="0"/>
-                <w:i w:val="0"/>
-                <w:color w:val="000000"/>
-                <w:sz w:val="18"/>
-              </w:rPr>
-              <w:t>GridSearchCV with the hint's forest grid, scored on ROC-AUC rather than accuracy</w:t>
-            </w:r>
-          </w:p>
-        </w:tc>
-      </w:tr>
-      <w:tr>
-        <w:trPr>
-          <w:cantSplit w:val="true"/>
-        </w:trPr>
-        <w:tc>
-          <w:tcPr>
-            <w:tcW w:type="dxa" w:w="2434"/>
-            <w:tcMar>
-              <w:top w:w="40" w:type="dxa"/>
-              <w:bottom w:w="40" w:type="dxa"/>
-              <w:left w:w="110" w:type="dxa"/>
-              <w:right w:w="110" w:type="dxa"/>
-            </w:tcMar>
-            <w:vAlign w:val="center"/>
-          </w:tcPr>
-          <w:p>
-            <w:pPr>
-              <w:spacing w:line="240" w:lineRule="auto" w:after="0"/>
-              <w:jc w:val="left"/>
-            </w:pPr>
-            <w:r/>
-            <w:r>
-              <w:rPr>
-                <w:rFonts w:ascii="Georgia" w:hAnsi="Georgia"/>
-                <w:b w:val="0"/>
-                <w:i w:val="0"/>
-                <w:color w:val="000000"/>
-                <w:sz w:val="18"/>
-              </w:rPr>
-              <w:t>8. Ethical considerations</w:t>
-            </w:r>
-          </w:p>
-        </w:tc>
-        <w:tc>
-          <w:tcPr>
-            <w:tcW w:type="dxa" w:w="1310"/>
-            <w:tcMar>
-              <w:top w:w="40" w:type="dxa"/>
-              <w:bottom w:w="40" w:type="dxa"/>
-              <w:left w:w="110" w:type="dxa"/>
-              <w:right w:w="110" w:type="dxa"/>
-            </w:tcMar>
-            <w:vAlign w:val="center"/>
-          </w:tcPr>
-          <w:p>
-            <w:pPr>
-              <w:spacing w:line="240" w:lineRule="auto" w:after="0"/>
-              <w:jc w:val="left"/>
-            </w:pPr>
-            <w:r/>
-            <w:r>
-              <w:rPr>
-                <w:rFonts w:ascii="Georgia" w:hAnsi="Georgia"/>
-                <w:b w:val="0"/>
-                <w:i w:val="0"/>
-                <w:color w:val="000000"/>
-                <w:sz w:val="18"/>
-              </w:rPr>
-              <w:t>13</w:t>
-            </w:r>
-          </w:p>
-        </w:tc>
-        <w:tc>
-          <w:tcPr>
-            <w:tcW w:type="dxa" w:w="5616"/>
-            <w:tcMar>
-              <w:top w:w="40" w:type="dxa"/>
-              <w:bottom w:w="40" w:type="dxa"/>
-              <w:left w:w="110" w:type="dxa"/>
-              <w:right w:w="110" w:type="dxa"/>
-            </w:tcMar>
-            <w:vAlign w:val="center"/>
-          </w:tcPr>
-          <w:p>
-            <w:pPr>
-              <w:spacing w:line="240" w:lineRule="auto" w:after="0"/>
-              <w:jc w:val="left"/>
-            </w:pPr>
-            <w:r/>
-            <w:r>
-              <w:rPr>
-                <w:rFonts w:ascii="Georgia" w:hAnsi="Georgia"/>
-                <w:b w:val="0"/>
-                <w:i w:val="0"/>
-                <w:color w:val="000000"/>
-                <w:sz w:val="18"/>
-              </w:rPr>
-              <w:t>Markdown cell answering the hint's questions, plus a subgroup check</w:t>
-            </w:r>
-          </w:p>
-        </w:tc>
-      </w:tr>
-    </w:tbl>
     <w:sectPr>
       <w:headerReference w:type="default" r:id="rId9"/>
       <w:pgSz w:w="12240" w:h="15840"/>

</xml_diff>

<commit_message>
Explain each screenshot in the text and fix the Appendix A layout
- Figure 4: describe how the pipeline cell enforces the grouped split, the
  no-overlap assertion, scaling, one-hot encoding, and rare-level pooling
- Figure 5: explain what the classification reports show and why (the
  forest labels nearly everything "not readmitted"; class weights of about
  8 to 1 make the logistic regression flag 36.9%)
- Say why the logistic regression uses balanced class weights
- Figure 8: state the grid searched and the settings chosen
- Appendix A: put the label and the Colab link on their own left-aligned
  lines, so the label is no longer stretched across the page
</commit_message>
<xml_diff>
--- a/Diabetes_Readmission_Deliverable1_Chinthaluri_Abburi.docx
+++ b/Diabetes_Readmission_Deliverable1_Chinthaluri_Abburi.docx
@@ -687,7 +687,7 @@
           <w:color w:val="000000"/>
           <w:sz w:val="22"/>
         </w:rPr>
-        <w:t>Table 1 lists the selected features and their treatment, and Table 2 logs each row-level step. Features were kept when available by discharge and clinically motivated or associated with the outcome. Deaths and hospice discharges were removed because readmission is impossible, leaving 99,340 encounters from 69,987 patients. The 915 ICD-9 codes were collapsed into nine groups so that rare codes do not each demand a parameter. Race, gender, and payer were excluded from the predictors and reserved for fairness checks. One-hot encoding and scaling were fit after the split, inside a scikit-learn pipeline (Pedregosa et al., 2011), because fitting them on all rows leaks test information into training (Kaufman et al., 2012), as Figure 4 shows.</w:t>
+        <w:t>Table 1 lists the selected features and their treatment, and Table 2 logs each row-level step. Features were kept when available by discharge and clinically motivated or associated with the outcome. Deaths and hospice discharges were removed because readmission is impossible, leaving 99,340 encounters from 69,987 patients. The 915 ICD-9 codes were collapsed into nine groups so that rare codes do not each demand a parameter. Race, gender, and payer were excluded from the predictors and reserved for fairness checks. One-hot encoding and scaling were fit after the split, inside a scikit-learn pipeline (Pedregosa et al., 2011), because fitting them on all rows leaks test information into training (Kaufman et al., 2012). Figure 4 shows how the notebook enforces these choices. GroupShuffleSplit holds out a quarter of the patients (17,497), not a quarter of the rows, and an assertion stops the run if any patient appears on both sides. Inside the pipeline, numeric inputs are standardized and categorical inputs one-hot encoded, with levels seen in fewer than 1% of encounters pooled, so that a rare category cannot become an unstable coefficient of its own; the 10 numeric and 19 categorical inputs become 102 model columns.</w:t>
       </w:r>
     </w:p>
     <w:p>
@@ -2823,7 +2823,7 @@
           <w:color w:val="000000"/>
           <w:sz w:val="22"/>
         </w:rPr>
-        <w:t>The initial model is an L2-regularized logistic regression with balanced class weights. It is the reference standard for clinical prediction (Steyerberg, 2019), its coefficients can be inspected when a score allocates care (Rudin, 2019), and established readmission indices such as LACE are themselves additive risk scores (van Walraven et al., 2010). A random forest (Breiman, 2001) at default settings serves as a nonlinear comparison that can capture interactions the linear model misses. Data were split 75/25 by patient, five-fold stratified group cross-validation was run on the training set, and a prior-rate dummy and a prior-admissions heuristic anchor the results.</w:t>
+        <w:t>The initial model is an L2-regularized logistic regression with balanced class weights, so that the rare readmissions are not outweighed by the majority class. It is the reference standard for clinical prediction (Steyerberg, 2019), its coefficients can be inspected when a score allocates care (Rudin, 2019), and established readmission indices such as LACE are themselves additive risk scores (van Walraven et al., 2010). A random forest (Breiman, 2001) at default settings serves as a nonlinear comparison that can capture interactions the linear model misses. Data were split 75/25 by patient, five-fold stratified group cross-validation was run on the training set, and a prior-rate dummy and a prior-admissions heuristic anchor the results.</w:t>
       </w:r>
     </w:p>
     <w:p>
@@ -2860,7 +2860,7 @@
           <w:color w:val="000000"/>
           <w:sz w:val="22"/>
         </w:rPr>
-        <w:t xml:space="preserve"> = .005) and a test AUC of .661 (95% CI [.650, .673]), typical of published models (Kansagara et al., 2011). The default forest ranked worse by .026 and exposed the accuracy trap: its 88.7% accuracy equals the dummy's, yet it caught 0.1% of readmissions, against 57% for the logistic regression. The model beat the heuristic by .056 AUC (95% CI [.048, .065]) but tied it in the top risk decile (lift 2.08 vs. 2.09) and pulled ahead only at 20% capacity (1.85 vs. 1.69). Prior admissions and discharge to a facility were among the largest effects (Figure 7). A random row split moved AUC by under .01 for both models, so patient overlap biases little here, but the grouped split is kept because it answers the deployment question of performance on new patients.</w:t>
+        <w:t xml:space="preserve"> = .005) and a test AUC of .661 (95% CI [.650, .673]), typical of published models (Kansagara et al., 2011). The default forest ranked worse by .026 and exposed the accuracy trap: its 88.7% accuracy equals the dummy's, yet it caught 0.1% of readmissions, against 57% for the logistic regression. The classification reports in Figure 5 show the mechanism: at the default 0.5 threshold the forest labels almost every encounter “not readmitted,” whereas the logistic regression's class weights, about 8 to 1 in favor of readmissions, lead it to flag 36.9% of encounters, trading precision (.175) for recall (.573). The logistic regression beat the heuristic by .056 AUC (95% CI [.048, .065]) but tied it in the top risk decile (lift 2.08 vs. 2.09) and pulled ahead only at 20% capacity (1.85 vs. 1.69). Prior admissions and discharge to a facility were among the largest effects (Figure 7). A random row split moved AUC by under .01 for both models, so patient overlap biases little here, but the grouped split is kept because it answers the deployment question of performance on new patients.</w:t>
       </w:r>
     </w:p>
     <w:p>
@@ -4832,7 +4832,7 @@
           <w:color w:val="000000"/>
           <w:sz w:val="22"/>
         </w:rPr>
-        <w:t>GridSearchCV tuned both models (Table 4, Figure 8) on folds grouped by patient and scored on ROC-AUC, because accuracy rewards the do-nothing behavior shown above. Limiting tree depth raised the forest's test AUC from .635 to .665, whereas the logistic regression barely moved (.661 to .662), because its discrimination is nearly flat across the penalty grid. The tuned forest and the logistic regression are statistically indistinguishable (difference 95% CI [−.001, .008]), so the interpretable model remains the working choice (Rudin, 2019). Class weighting also inflated the mean predicted risk to .469 against an observed test-set rate of .113, so Deliverable 2 will calibrate scores and set thresholds from program capacity.</w:t>
+        <w:t>GridSearchCV tuned both models (Table 4, Figure 8) on folds grouped by patient and scored on ROC-AUC, because accuracy rewards the do-nothing behavior shown above. The code in Figure 8 tries four penalty strengths for the logistic regression and six forest settings (100 or 200 trees, with a maximum depth of 10, 20, or unlimited), scores each on three folds, and refits the best; it chose C = 0.01 and a depth of 10 with 200 trees. Limiting tree depth raised the forest's test AUC from .635 to .665, whereas the logistic regression barely moved (.661 to .662), because its discrimination is nearly flat across the penalty grid. The tuned forest and the logistic regression are statistically indistinguishable (difference 95% CI [−.001, .008]), so the interpretable model remains the working choice (Rudin, 2019). Class weighting also inflated the mean predicted risk to .469 against an observed test-set rate of .113, so Deliverable 2 will calibrate scores and set thresholds from program capacity.</w:t>
       </w:r>
     </w:p>
     <w:p>
@@ -8902,7 +8902,7 @@
     <w:p>
       <w:pPr>
         <w:spacing w:line="480" w:lineRule="auto" w:after="0"/>
-        <w:jc w:val="both"/>
+        <w:jc w:val="left"/>
       </w:pPr>
       <w:r>
         <w:rPr>
@@ -8912,7 +8912,22 @@
           <w:color w:val="000000"/>
           <w:sz w:val="22"/>
         </w:rPr>
-        <w:t xml:space="preserve">Notebook link (view access for the instructor): </w:t>
+        <w:t>Notebook link (view access for the instructor):</w:t>
+      </w:r>
+    </w:p>
+    <w:p>
+      <w:pPr>
+        <w:spacing w:line="480" w:lineRule="auto" w:after="0"/>
+        <w:jc w:val="left"/>
+      </w:pPr>
+      <w:r>
+        <w:rPr>
+          <w:rFonts w:ascii="Georgia" w:hAnsi="Georgia"/>
+          <w:b w:val="0"/>
+          <w:i w:val="0"/>
+          <w:color w:val="000000"/>
+          <w:sz w:val="22"/>
+        </w:rPr>
       </w:r>
       <w:hyperlink r:id="rId18">
         <w:r>

</xml_diff>